<commit_message>
feat: enhance Word report analysis insights
</commit_message>
<xml_diff>
--- a/templates/score_report_template.docx
+++ b/templates/score_report_template.docx
@@ -956,7 +956,7 @@
     </w:p>
     <w:p>
       <w:pPr>
-        <w:keepLines/>
+        <w:keepLines w:val="0"/>
         <w:spacing w:before="200" w:after="160" w:line="348" w:lineRule="auto"/>
         <w:ind w:left="283" w:right="170"/>
         <w:pBdr>
@@ -972,6 +972,7 @@
           <w:sz w:val="23"/>
         </w:rPr>
         <w:t>分布结论</w:t>
+        <w:br/>
       </w:r>
       <w:r>
         <w:rPr>
@@ -980,62 +981,7 @@
           <w:color w:val="374151"/>
           <w:sz w:val="21"/>
         </w:rPr>
-        <w:br/>
-        <w:t xml:space="preserve">本次平均分为 </w:t>
-      </w:r>
-      <w:r>
-        <w:rPr>
-          <w:rFonts w:ascii="Arial" w:hAnsi="Arial" w:eastAsia="Microsoft YaHei"/>
-          <w:b/>
-          <w:color w:val="1F4E78"/>
-          <w:sz w:val="21"/>
-        </w:rPr>
-        <w:t>{{ average_score }}</w:t>
-      </w:r>
-      <w:r>
-        <w:rPr>
-          <w:rFonts w:ascii="Arial" w:hAnsi="Arial" w:eastAsia="Microsoft YaHei"/>
-          <w:b w:val="0"/>
-          <w:color w:val="374151"/>
-          <w:sz w:val="21"/>
-        </w:rPr>
-        <w:t xml:space="preserve"> 分，最高分为 </w:t>
-      </w:r>
-      <w:r>
-        <w:rPr>
-          <w:rFonts w:ascii="Arial" w:hAnsi="Arial" w:eastAsia="Microsoft YaHei"/>
-          <w:b/>
-          <w:color w:val="1F4E78"/>
-          <w:sz w:val="21"/>
-        </w:rPr>
-        <w:t>{{ highest_score }}</w:t>
-      </w:r>
-      <w:r>
-        <w:rPr>
-          <w:rFonts w:ascii="Arial" w:hAnsi="Arial" w:eastAsia="Microsoft YaHei"/>
-          <w:b w:val="0"/>
-          <w:color w:val="374151"/>
-          <w:sz w:val="21"/>
-        </w:rPr>
-        <w:t xml:space="preserve"> 分，最低分为 </w:t>
-      </w:r>
-      <w:r>
-        <w:rPr>
-          <w:rFonts w:ascii="Arial" w:hAnsi="Arial" w:eastAsia="Microsoft YaHei"/>
-          <w:b/>
-          <w:color w:val="1F4E78"/>
-          <w:sz w:val="21"/>
-        </w:rPr>
-        <w:t>{{ lowest_score }}</w:t>
-      </w:r>
-      <w:r>
-        <w:rPr>
-          <w:rFonts w:ascii="Arial" w:hAnsi="Arial" w:eastAsia="Microsoft YaHei"/>
-          <w:b w:val="0"/>
-          <w:color w:val="374151"/>
-          <w:sz w:val="21"/>
-        </w:rPr>
-        <w:t xml:space="preserve"> 分。具体成绩集中区间以图中分布为准。</w:t>
+        <w:t>{{ distribution_analysis }}</w:t>
       </w:r>
     </w:p>
     <w:p>
@@ -1091,7 +1037,7 @@
     </w:p>
     <w:p>
       <w:pPr>
-        <w:keepLines/>
+        <w:keepLines w:val="0"/>
         <w:spacing w:before="200" w:after="160" w:line="348" w:lineRule="auto"/>
         <w:ind w:left="283" w:right="170"/>
         <w:pBdr>
@@ -1107,6 +1053,7 @@
           <w:sz w:val="23"/>
         </w:rPr>
         <w:t>等级结构结论</w:t>
+        <w:br/>
       </w:r>
       <w:r>
         <w:rPr>
@@ -1115,44 +1062,7 @@
           <w:color w:val="374151"/>
           <w:sz w:val="21"/>
         </w:rPr>
-        <w:br/>
-        <w:t xml:space="preserve">本次及格率为 </w:t>
-      </w:r>
-      <w:r>
-        <w:rPr>
-          <w:rFonts w:ascii="Arial" w:hAnsi="Arial" w:eastAsia="Microsoft YaHei"/>
-          <w:b/>
-          <w:color w:val="1F4E78"/>
-          <w:sz w:val="21"/>
-        </w:rPr>
-        <w:t>{{ pass_rate }}</w:t>
-      </w:r>
-      <w:r>
-        <w:rPr>
-          <w:rFonts w:ascii="Arial" w:hAnsi="Arial" w:eastAsia="Microsoft YaHei"/>
-          <w:b w:val="0"/>
-          <w:color w:val="374151"/>
-          <w:sz w:val="21"/>
-        </w:rPr>
-        <w:t xml:space="preserve">，优秀率为 </w:t>
-      </w:r>
-      <w:r>
-        <w:rPr>
-          <w:rFonts w:ascii="Arial" w:hAnsi="Arial" w:eastAsia="Microsoft YaHei"/>
-          <w:b/>
-          <w:color w:val="1F4E78"/>
-          <w:sz w:val="21"/>
-        </w:rPr>
-        <w:t>{{ excellent_rate }}</w:t>
-      </w:r>
-      <w:r>
-        <w:rPr>
-          <w:rFonts w:ascii="Arial" w:hAnsi="Arial" w:eastAsia="Microsoft YaHei"/>
-          <w:b w:val="0"/>
-          <w:color w:val="374151"/>
-          <w:sz w:val="21"/>
-        </w:rPr>
-        <w:t>。各等级人数及占比以图中结构为准。</w:t>
+        <w:t>{{ level_analysis }}</w:t>
       </w:r>
     </w:p>
     <w:p>

</xml_diff>

<commit_message>
feat: upgrade professional score report
</commit_message>
<xml_diff>
--- a/templates/score_report_template.docx
+++ b/templates/score_report_template.docx
@@ -4,17 +4,15 @@
   <w:body>
     <w:p>
       <w:pPr>
-        <w:spacing w:after="1160"/>
-        <w:pBdr>
-          <w:bottom w:val="single" w:sz="10" w:color="2563EB" w:space="5"/>
-        </w:pBdr>
+        <w:keepNext w:val="0"/>
+        <w:spacing w:before="0" w:after="560" w:line="276" w:lineRule="auto"/>
       </w:pPr>
       <w:r>
         <w:rPr>
           <w:rFonts w:ascii="Arial" w:hAnsi="Arial" w:eastAsia="Microsoft YaHei"/>
           <w:b/>
           <w:color w:val="1F4E78"/>
-          <w:sz w:val="21"/>
+          <w:sz w:val="20"/>
         </w:rPr>
         <w:t>成绩分析工具  ·  数据统计  ·  可视化分析  ·  教学参考</w:t>
       </w:r>
@@ -22,22 +20,16 @@
     <w:p>
       <w:pPr>
         <w:pStyle w:val="Title"/>
-        <w:spacing w:before="320" w:after="200"/>
         <w:jc w:val="center"/>
       </w:pPr>
       <w:r>
-        <w:rPr>
-          <w:rFonts w:ascii="Arial" w:hAnsi="Arial" w:eastAsia="Microsoft YaHei"/>
-          <w:b/>
-          <w:color w:val="1F4E78"/>
-          <w:sz w:val="56"/>
-        </w:rPr>
         <w:t>学生成绩分析报告</w:t>
       </w:r>
     </w:p>
     <w:p>
       <w:pPr>
-        <w:spacing w:after="680"/>
+        <w:keepNext w:val="0"/>
+        <w:spacing w:before="0" w:after="320" w:line="276" w:lineRule="auto"/>
         <w:jc w:val="center"/>
       </w:pPr>
       <w:r>
@@ -52,36 +44,37 @@
     </w:p>
     <w:tbl>
       <w:tblPr>
-        <w:tblW w:type="dxa" w:w="7824"/>
+        <w:tblStyle w:val="TableGrid"/>
+        <w:tblW w:type="dxa" w:w="9411"/>
         <w:jc w:val="center"/>
         <w:tblLayout w:type="fixed"/>
         <w:tblLook w:firstColumn="1" w:firstRow="1" w:lastColumn="0" w:lastRow="0" w:noHBand="0" w:noVBand="1" w:val="04A0"/>
       </w:tblPr>
       <w:tblGrid>
-        <w:gridCol w:w="1928"/>
-        <w:gridCol w:w="5896"/>
+        <w:gridCol w:w="2154"/>
+        <w:gridCol w:w="7257"/>
       </w:tblGrid>
       <w:tr>
         <w:trPr>
-          <w:trHeight w:val="624" w:hRule="atLeast"/>
+          <w:trHeight w:val="595" w:hRule="atLeast"/>
+          <w:cantSplit/>
         </w:trPr>
         <w:tc>
           <w:tcPr>
-            <w:tcW w:type="dxa" w:w="1928"/>
+            <w:tcW w:type="dxa" w:w="2154"/>
             <w:vAlign w:val="center"/>
             <w:tcMar>
-              <w:top w:w="120" w:type="dxa"/>
-              <w:start w:w="160" w:type="dxa"/>
-              <w:bottom w:w="120" w:type="dxa"/>
-              <w:end w:w="160" w:type="dxa"/>
+              <w:top w:w="90" w:type="dxa"/>
+              <w:start w:w="120" w:type="dxa"/>
+              <w:bottom w:w="90" w:type="dxa"/>
+              <w:end w:w="120" w:type="dxa"/>
             </w:tcMar>
-            <w:tcBorders>
-              <w:bottom w:val="single" w:sz="6" w:color="C9D7EB" w:space="0"/>
-            </w:tcBorders>
+            <w:shd w:fill="F3F6FA"/>
           </w:tcPr>
           <w:p>
             <w:pPr>
-              <w:spacing w:after="0"/>
+              <w:keepNext w:val="0"/>
+              <w:spacing w:before="0" w:after="0" w:line="276" w:lineRule="auto"/>
               <w:jc w:val="right"/>
             </w:pPr>
             <w:r>
@@ -89,33 +82,32 @@
                 <w:rFonts w:ascii="Arial" w:hAnsi="Arial" w:eastAsia="Microsoft YaHei"/>
                 <w:b/>
                 <w:color w:val="1F4E78"/>
-                <w:sz w:val="21"/>
+                <w:sz w:val="20"/>
               </w:rPr>
-              <w:t>学校：</w:t>
+              <w:t>学校名称：</w:t>
             </w:r>
           </w:p>
         </w:tc>
         <w:tc>
           <w:tcPr>
-            <w:tcW w:type="dxa" w:w="5896"/>
+            <w:tcW w:type="dxa" w:w="7257"/>
             <w:vAlign w:val="center"/>
             <w:tcMar>
-              <w:top w:w="120" w:type="dxa"/>
-              <w:start w:w="160" w:type="dxa"/>
-              <w:bottom w:w="120" w:type="dxa"/>
-              <w:end w:w="160" w:type="dxa"/>
+              <w:top w:w="90" w:type="dxa"/>
+              <w:start w:w="120" w:type="dxa"/>
+              <w:bottom w:w="90" w:type="dxa"/>
+              <w:end w:w="120" w:type="dxa"/>
             </w:tcMar>
-            <w:tcBorders>
-              <w:bottom w:val="single" w:sz="6" w:color="C9D7EB" w:space="0"/>
-            </w:tcBorders>
           </w:tcPr>
           <w:p>
             <w:pPr>
-              <w:spacing w:after="0"/>
+              <w:keepNext w:val="0"/>
+              <w:spacing w:before="0" w:after="0" w:line="276" w:lineRule="auto"/>
             </w:pPr>
             <w:r>
               <w:rPr>
                 <w:rFonts w:ascii="Arial" w:hAnsi="Arial" w:eastAsia="Microsoft YaHei"/>
+                <w:b w:val="0"/>
                 <w:color w:val="374151"/>
                 <w:sz w:val="21"/>
               </w:rPr>
@@ -126,25 +118,25 @@
       </w:tr>
       <w:tr>
         <w:trPr>
-          <w:trHeight w:val="624" w:hRule="atLeast"/>
+          <w:trHeight w:val="595" w:hRule="atLeast"/>
+          <w:cantSplit/>
         </w:trPr>
         <w:tc>
           <w:tcPr>
-            <w:tcW w:type="dxa" w:w="1928"/>
+            <w:tcW w:type="dxa" w:w="2154"/>
             <w:vAlign w:val="center"/>
             <w:tcMar>
-              <w:top w:w="120" w:type="dxa"/>
-              <w:start w:w="160" w:type="dxa"/>
-              <w:bottom w:w="120" w:type="dxa"/>
-              <w:end w:w="160" w:type="dxa"/>
+              <w:top w:w="90" w:type="dxa"/>
+              <w:start w:w="120" w:type="dxa"/>
+              <w:bottom w:w="90" w:type="dxa"/>
+              <w:end w:w="120" w:type="dxa"/>
             </w:tcMar>
-            <w:tcBorders>
-              <w:bottom w:val="single" w:sz="6" w:color="C9D7EB" w:space="0"/>
-            </w:tcBorders>
+            <w:shd w:fill="F3F6FA"/>
           </w:tcPr>
           <w:p>
             <w:pPr>
-              <w:spacing w:after="0"/>
+              <w:keepNext w:val="0"/>
+              <w:spacing w:before="0" w:after="0" w:line="276" w:lineRule="auto"/>
               <w:jc w:val="right"/>
             </w:pPr>
             <w:r>
@@ -152,7 +144,7 @@
                 <w:rFonts w:ascii="Arial" w:hAnsi="Arial" w:eastAsia="Microsoft YaHei"/>
                 <w:b/>
                 <w:color w:val="1F4E78"/>
-                <w:sz w:val="21"/>
+                <w:sz w:val="20"/>
               </w:rPr>
               <w:t>考试名称：</w:t>
             </w:r>
@@ -160,25 +152,24 @@
         </w:tc>
         <w:tc>
           <w:tcPr>
-            <w:tcW w:type="dxa" w:w="5896"/>
+            <w:tcW w:type="dxa" w:w="7257"/>
             <w:vAlign w:val="center"/>
             <w:tcMar>
-              <w:top w:w="120" w:type="dxa"/>
-              <w:start w:w="160" w:type="dxa"/>
-              <w:bottom w:w="120" w:type="dxa"/>
-              <w:end w:w="160" w:type="dxa"/>
+              <w:top w:w="90" w:type="dxa"/>
+              <w:start w:w="120" w:type="dxa"/>
+              <w:bottom w:w="90" w:type="dxa"/>
+              <w:end w:w="120" w:type="dxa"/>
             </w:tcMar>
-            <w:tcBorders>
-              <w:bottom w:val="single" w:sz="6" w:color="C9D7EB" w:space="0"/>
-            </w:tcBorders>
           </w:tcPr>
           <w:p>
             <w:pPr>
-              <w:spacing w:after="0"/>
+              <w:keepNext w:val="0"/>
+              <w:spacing w:before="0" w:after="0" w:line="276" w:lineRule="auto"/>
             </w:pPr>
             <w:r>
               <w:rPr>
                 <w:rFonts w:ascii="Arial" w:hAnsi="Arial" w:eastAsia="Microsoft YaHei"/>
+                <w:b w:val="0"/>
                 <w:color w:val="374151"/>
                 <w:sz w:val="21"/>
               </w:rPr>
@@ -189,25 +180,25 @@
       </w:tr>
       <w:tr>
         <w:trPr>
-          <w:trHeight w:val="624" w:hRule="atLeast"/>
+          <w:trHeight w:val="595" w:hRule="atLeast"/>
+          <w:cantSplit/>
         </w:trPr>
         <w:tc>
           <w:tcPr>
-            <w:tcW w:type="dxa" w:w="1928"/>
+            <w:tcW w:type="dxa" w:w="2154"/>
             <w:vAlign w:val="center"/>
             <w:tcMar>
-              <w:top w:w="120" w:type="dxa"/>
-              <w:start w:w="160" w:type="dxa"/>
-              <w:bottom w:w="120" w:type="dxa"/>
-              <w:end w:w="160" w:type="dxa"/>
+              <w:top w:w="90" w:type="dxa"/>
+              <w:start w:w="120" w:type="dxa"/>
+              <w:bottom w:w="90" w:type="dxa"/>
+              <w:end w:w="120" w:type="dxa"/>
             </w:tcMar>
-            <w:tcBorders>
-              <w:bottom w:val="single" w:sz="6" w:color="C9D7EB" w:space="0"/>
-            </w:tcBorders>
+            <w:shd w:fill="F3F6FA"/>
           </w:tcPr>
           <w:p>
             <w:pPr>
-              <w:spacing w:after="0"/>
+              <w:keepNext w:val="0"/>
+              <w:spacing w:before="0" w:after="0" w:line="276" w:lineRule="auto"/>
               <w:jc w:val="right"/>
             </w:pPr>
             <w:r>
@@ -215,33 +206,32 @@
                 <w:rFonts w:ascii="Arial" w:hAnsi="Arial" w:eastAsia="Microsoft YaHei"/>
                 <w:b/>
                 <w:color w:val="1F4E78"/>
-                <w:sz w:val="21"/>
+                <w:sz w:val="20"/>
               </w:rPr>
-              <w:t>班级：</w:t>
+              <w:t>分析范围：</w:t>
             </w:r>
           </w:p>
         </w:tc>
         <w:tc>
           <w:tcPr>
-            <w:tcW w:type="dxa" w:w="5896"/>
+            <w:tcW w:type="dxa" w:w="7257"/>
             <w:vAlign w:val="center"/>
             <w:tcMar>
-              <w:top w:w="120" w:type="dxa"/>
-              <w:start w:w="160" w:type="dxa"/>
-              <w:bottom w:w="120" w:type="dxa"/>
-              <w:end w:w="160" w:type="dxa"/>
+              <w:top w:w="90" w:type="dxa"/>
+              <w:start w:w="120" w:type="dxa"/>
+              <w:bottom w:w="90" w:type="dxa"/>
+              <w:end w:w="120" w:type="dxa"/>
             </w:tcMar>
-            <w:tcBorders>
-              <w:bottom w:val="single" w:sz="6" w:color="C9D7EB" w:space="0"/>
-            </w:tcBorders>
           </w:tcPr>
           <w:p>
             <w:pPr>
-              <w:spacing w:after="0"/>
+              <w:keepNext w:val="0"/>
+              <w:spacing w:before="0" w:after="0" w:line="276" w:lineRule="auto"/>
             </w:pPr>
             <w:r>
               <w:rPr>
                 <w:rFonts w:ascii="Arial" w:hAnsi="Arial" w:eastAsia="Microsoft YaHei"/>
+                <w:b w:val="0"/>
                 <w:color w:val="374151"/>
                 <w:sz w:val="21"/>
               </w:rPr>
@@ -252,25 +242,25 @@
       </w:tr>
       <w:tr>
         <w:trPr>
-          <w:trHeight w:val="624" w:hRule="atLeast"/>
+          <w:trHeight w:val="595" w:hRule="atLeast"/>
+          <w:cantSplit/>
         </w:trPr>
         <w:tc>
           <w:tcPr>
-            <w:tcW w:type="dxa" w:w="1928"/>
+            <w:tcW w:type="dxa" w:w="2154"/>
             <w:vAlign w:val="center"/>
             <w:tcMar>
-              <w:top w:w="120" w:type="dxa"/>
-              <w:start w:w="160" w:type="dxa"/>
-              <w:bottom w:w="120" w:type="dxa"/>
-              <w:end w:w="160" w:type="dxa"/>
+              <w:top w:w="90" w:type="dxa"/>
+              <w:start w:w="120" w:type="dxa"/>
+              <w:bottom w:w="90" w:type="dxa"/>
+              <w:end w:w="120" w:type="dxa"/>
             </w:tcMar>
-            <w:tcBorders>
-              <w:bottom w:val="single" w:sz="6" w:color="C9D7EB" w:space="0"/>
-            </w:tcBorders>
+            <w:shd w:fill="F3F6FA"/>
           </w:tcPr>
           <w:p>
             <w:pPr>
-              <w:spacing w:after="0"/>
+              <w:keepNext w:val="0"/>
+              <w:spacing w:before="0" w:after="0" w:line="276" w:lineRule="auto"/>
               <w:jc w:val="right"/>
             </w:pPr>
             <w:r>
@@ -278,7 +268,7 @@
                 <w:rFonts w:ascii="Arial" w:hAnsi="Arial" w:eastAsia="Microsoft YaHei"/>
                 <w:b/>
                 <w:color w:val="1F4E78"/>
-                <w:sz w:val="21"/>
+                <w:sz w:val="20"/>
               </w:rPr>
               <w:t>分析科目：</w:t>
             </w:r>
@@ -286,25 +276,24 @@
         </w:tc>
         <w:tc>
           <w:tcPr>
-            <w:tcW w:type="dxa" w:w="5896"/>
+            <w:tcW w:type="dxa" w:w="7257"/>
             <w:vAlign w:val="center"/>
             <w:tcMar>
-              <w:top w:w="120" w:type="dxa"/>
-              <w:start w:w="160" w:type="dxa"/>
-              <w:bottom w:w="120" w:type="dxa"/>
-              <w:end w:w="160" w:type="dxa"/>
+              <w:top w:w="90" w:type="dxa"/>
+              <w:start w:w="120" w:type="dxa"/>
+              <w:bottom w:w="90" w:type="dxa"/>
+              <w:end w:w="120" w:type="dxa"/>
             </w:tcMar>
-            <w:tcBorders>
-              <w:bottom w:val="single" w:sz="6" w:color="C9D7EB" w:space="0"/>
-            </w:tcBorders>
           </w:tcPr>
           <w:p>
             <w:pPr>
-              <w:spacing w:after="0"/>
+              <w:keepNext w:val="0"/>
+              <w:spacing w:before="0" w:after="0" w:line="276" w:lineRule="auto"/>
             </w:pPr>
             <w:r>
               <w:rPr>
                 <w:rFonts w:ascii="Arial" w:hAnsi="Arial" w:eastAsia="Microsoft YaHei"/>
+                <w:b w:val="0"/>
                 <w:color w:val="374151"/>
                 <w:sz w:val="21"/>
               </w:rPr>
@@ -315,25 +304,25 @@
       </w:tr>
       <w:tr>
         <w:trPr>
-          <w:trHeight w:val="624" w:hRule="atLeast"/>
+          <w:trHeight w:val="595" w:hRule="atLeast"/>
+          <w:cantSplit/>
         </w:trPr>
         <w:tc>
           <w:tcPr>
-            <w:tcW w:type="dxa" w:w="1928"/>
+            <w:tcW w:type="dxa" w:w="2154"/>
             <w:vAlign w:val="center"/>
             <w:tcMar>
-              <w:top w:w="120" w:type="dxa"/>
-              <w:start w:w="160" w:type="dxa"/>
-              <w:bottom w:w="120" w:type="dxa"/>
-              <w:end w:w="160" w:type="dxa"/>
+              <w:top w:w="90" w:type="dxa"/>
+              <w:start w:w="120" w:type="dxa"/>
+              <w:bottom w:w="90" w:type="dxa"/>
+              <w:end w:w="120" w:type="dxa"/>
             </w:tcMar>
-            <w:tcBorders>
-              <w:bottom w:val="single" w:sz="6" w:color="C9D7EB" w:space="0"/>
-            </w:tcBorders>
+            <w:shd w:fill="F3F6FA"/>
           </w:tcPr>
           <w:p>
             <w:pPr>
-              <w:spacing w:after="0"/>
+              <w:keepNext w:val="0"/>
+              <w:spacing w:before="0" w:after="0" w:line="276" w:lineRule="auto"/>
               <w:jc w:val="right"/>
             </w:pPr>
             <w:r>
@@ -341,37 +330,98 @@
                 <w:rFonts w:ascii="Arial" w:hAnsi="Arial" w:eastAsia="Microsoft YaHei"/>
                 <w:b/>
                 <w:color w:val="1F4E78"/>
-                <w:sz w:val="21"/>
+                <w:sz w:val="20"/>
               </w:rPr>
-              <w:t>生成日期：</w:t>
+              <w:t>参考人数：</w:t>
             </w:r>
           </w:p>
         </w:tc>
         <w:tc>
           <w:tcPr>
-            <w:tcW w:type="dxa" w:w="5896"/>
+            <w:tcW w:type="dxa" w:w="7257"/>
             <w:vAlign w:val="center"/>
             <w:tcMar>
-              <w:top w:w="120" w:type="dxa"/>
-              <w:start w:w="160" w:type="dxa"/>
-              <w:bottom w:w="120" w:type="dxa"/>
-              <w:end w:w="160" w:type="dxa"/>
+              <w:top w:w="90" w:type="dxa"/>
+              <w:start w:w="120" w:type="dxa"/>
+              <w:bottom w:w="90" w:type="dxa"/>
+              <w:end w:w="120" w:type="dxa"/>
             </w:tcMar>
-            <w:tcBorders>
-              <w:bottom w:val="single" w:sz="6" w:color="C9D7EB" w:space="0"/>
-            </w:tcBorders>
           </w:tcPr>
           <w:p>
             <w:pPr>
-              <w:spacing w:after="0"/>
+              <w:keepNext w:val="0"/>
+              <w:spacing w:before="0" w:after="0" w:line="276" w:lineRule="auto"/>
             </w:pPr>
             <w:r>
               <w:rPr>
                 <w:rFonts w:ascii="Arial" w:hAnsi="Arial" w:eastAsia="Microsoft YaHei"/>
+                <w:b w:val="0"/>
                 <w:color w:val="374151"/>
                 <w:sz w:val="21"/>
               </w:rPr>
-              <w:t>{{ report_date }}</w:t>
+              <w:t>{{ student_count }}</w:t>
+            </w:r>
+          </w:p>
+        </w:tc>
+      </w:tr>
+      <w:tr>
+        <w:trPr>
+          <w:trHeight w:val="595" w:hRule="atLeast"/>
+          <w:cantSplit/>
+        </w:trPr>
+        <w:tc>
+          <w:tcPr>
+            <w:tcW w:type="dxa" w:w="2154"/>
+            <w:vAlign w:val="center"/>
+            <w:tcMar>
+              <w:top w:w="90" w:type="dxa"/>
+              <w:start w:w="120" w:type="dxa"/>
+              <w:bottom w:w="90" w:type="dxa"/>
+              <w:end w:w="120" w:type="dxa"/>
+            </w:tcMar>
+            <w:shd w:fill="F3F6FA"/>
+          </w:tcPr>
+          <w:p>
+            <w:pPr>
+              <w:keepNext w:val="0"/>
+              <w:spacing w:before="0" w:after="0" w:line="276" w:lineRule="auto"/>
+              <w:jc w:val="right"/>
+            </w:pPr>
+            <w:r>
+              <w:rPr>
+                <w:rFonts w:ascii="Arial" w:hAnsi="Arial" w:eastAsia="Microsoft YaHei"/>
+                <w:b/>
+                <w:color w:val="1F4E78"/>
+                <w:sz w:val="20"/>
+              </w:rPr>
+              <w:t>生成时间：</w:t>
+            </w:r>
+          </w:p>
+        </w:tc>
+        <w:tc>
+          <w:tcPr>
+            <w:tcW w:type="dxa" w:w="7257"/>
+            <w:vAlign w:val="center"/>
+            <w:tcMar>
+              <w:top w:w="90" w:type="dxa"/>
+              <w:start w:w="120" w:type="dxa"/>
+              <w:bottom w:w="90" w:type="dxa"/>
+              <w:end w:w="120" w:type="dxa"/>
+            </w:tcMar>
+          </w:tcPr>
+          <w:p>
+            <w:pPr>
+              <w:keepNext w:val="0"/>
+              <w:spacing w:before="0" w:after="0" w:line="276" w:lineRule="auto"/>
+            </w:pPr>
+            <w:r>
+              <w:rPr>
+                <w:rFonts w:ascii="Arial" w:hAnsi="Arial" w:eastAsia="Microsoft YaHei"/>
+                <w:b w:val="0"/>
+                <w:color w:val="374151"/>
+                <w:sz w:val="21"/>
+              </w:rPr>
+              <w:t>{{ generated_at }}</w:t>
             </w:r>
           </w:p>
         </w:tc>
@@ -379,23 +429,35 @@
     </w:tbl>
     <w:p>
       <w:pPr>
-        <w:spacing w:before="960"/>
-        <w:jc w:val="center"/>
+        <w:keepNext w:val="0"/>
+        <w:spacing w:before="280" w:after="100" w:line="276" w:lineRule="auto"/>
+      </w:pPr>
+      <w:r>
+        <w:rPr>
+          <w:rFonts w:ascii="Arial" w:hAnsi="Arial" w:eastAsia="Microsoft YaHei"/>
+          <w:b/>
+          <w:color w:val="1F4E78"/>
+          <w:sz w:val="23"/>
+        </w:rPr>
+        <w:t>报告说明</w:t>
+      </w:r>
+    </w:p>
+    <w:p>
+      <w:pPr>
+        <w:keepNext w:val="0"/>
+        <w:spacing w:before="0" w:after="0" w:line="348" w:lineRule="auto"/>
       </w:pPr>
       <w:r>
         <w:rPr>
           <w:rFonts w:ascii="Arial" w:hAnsi="Arial" w:eastAsia="Microsoft YaHei"/>
           <w:b w:val="0"/>
-          <w:color w:val="6B7280"/>
-          <w:sz w:val="18"/>
+          <w:color w:val="374151"/>
+          <w:sz w:val="20"/>
         </w:rPr>
-        <w:t>基于当前分析结果自动生成</w:t>
+        <w:t>本报告基于当前页面筛选后的有效成绩自动生成，用于呈现核心指标、成绩分布、等级结构、各科表现和重点学生摘要，为教学复盘提供数据参考。</w:t>
       </w:r>
     </w:p>
     <w:p>
-      <w:pPr>
-        <w:spacing w:after="0"/>
-      </w:pPr>
       <w:r>
         <w:br w:type="page"/>
       </w:r>
@@ -403,34 +465,29 @@
     <w:p>
       <w:pPr>
         <w:pStyle w:val="Heading1"/>
-        <w:keepNext/>
       </w:pPr>
       <w:r>
-        <w:rPr>
-          <w:rFonts w:ascii="Arial" w:hAnsi="Arial" w:eastAsia="Microsoft YaHei"/>
-          <w:b/>
-          <w:color w:val="1F4E78"/>
-          <w:sz w:val="36"/>
-        </w:rPr>
-        <w:t>一、核心数据与总体分析</w:t>
+        <w:t>一、核心指标与总体结论</w:t>
       </w:r>
     </w:p>
     <w:p>
       <w:pPr>
-        <w:spacing w:after="240"/>
+        <w:keepNext w:val="0"/>
+        <w:spacing w:before="0" w:after="160" w:line="276" w:lineRule="auto"/>
       </w:pPr>
       <w:r>
         <w:rPr>
           <w:rFonts w:ascii="Arial" w:hAnsi="Arial" w:eastAsia="Microsoft YaHei"/>
           <w:b w:val="0"/>
-          <w:color w:val="6B7280"/>
-          <w:sz w:val="21"/>
+          <w:color w:val="64748B"/>
+          <w:sz w:val="20"/>
         </w:rPr>
-        <w:t>本页汇总当前班级与分析科目的关键成绩指标。</w:t>
+        <w:t>本页汇总当前分析范围与成绩列的关键指标，所有数值与网页当前结果保持一致。</w:t>
       </w:r>
     </w:p>
     <w:tbl>
       <w:tblPr>
+        <w:tblStyle w:val="TableGrid"/>
         <w:tblW w:type="dxa" w:w="9411"/>
         <w:jc w:val="center"/>
         <w:tblLayout w:type="fixed"/>
@@ -443,29 +500,25 @@
       </w:tblGrid>
       <w:tr>
         <w:trPr>
-          <w:trHeight w:val="680" w:hRule="atLeast"/>
+          <w:trHeight w:val="624" w:hRule="atLeast"/>
+          <w:cantSplit/>
         </w:trPr>
         <w:tc>
           <w:tcPr>
             <w:tcW w:type="dxa" w:w="3137"/>
             <w:vAlign w:val="center"/>
             <w:tcMar>
-              <w:top w:w="120" w:type="dxa"/>
+              <w:top w:w="90" w:type="dxa"/>
               <w:start w:w="120" w:type="dxa"/>
-              <w:bottom w:w="120" w:type="dxa"/>
+              <w:bottom w:w="90" w:type="dxa"/>
               <w:end w:w="120" w:type="dxa"/>
             </w:tcMar>
-            <w:tcBorders>
-              <w:top w:val="single" w:sz="6" w:color="C9D7EB" w:space="0"/>
-              <w:start w:val="single" w:sz="6" w:color="C9D7EB" w:space="0"/>
-              <w:bottom w:val="single" w:sz="6" w:color="C9D7EB" w:space="0"/>
-              <w:end w:val="single" w:sz="6" w:color="C9D7EB" w:space="0"/>
-            </w:tcBorders>
-            <w:shd w:fill="EAF2FF" w:val="clear"/>
+            <w:shd w:fill="F3F6FA"/>
           </w:tcPr>
           <w:p>
             <w:pPr>
-              <w:spacing w:after="0"/>
+              <w:keepNext w:val="0"/>
+              <w:spacing w:before="0" w:after="0" w:line="276" w:lineRule="auto"/>
               <w:jc w:val="center"/>
             </w:pPr>
             <w:r>
@@ -473,7 +526,7 @@
                 <w:rFonts w:ascii="Arial" w:hAnsi="Arial" w:eastAsia="Microsoft YaHei"/>
                 <w:b/>
                 <w:color w:val="1F4E78"/>
-                <w:sz w:val="22"/>
+                <w:sz w:val="21"/>
               </w:rPr>
               <w:t>参考人数</w:t>
             </w:r>
@@ -484,22 +537,17 @@
             <w:tcW w:type="dxa" w:w="3137"/>
             <w:vAlign w:val="center"/>
             <w:tcMar>
-              <w:top w:w="120" w:type="dxa"/>
+              <w:top w:w="90" w:type="dxa"/>
               <w:start w:w="120" w:type="dxa"/>
-              <w:bottom w:w="120" w:type="dxa"/>
+              <w:bottom w:w="90" w:type="dxa"/>
               <w:end w:w="120" w:type="dxa"/>
             </w:tcMar>
-            <w:tcBorders>
-              <w:top w:val="single" w:sz="6" w:color="C9D7EB" w:space="0"/>
-              <w:start w:val="single" w:sz="6" w:color="C9D7EB" w:space="0"/>
-              <w:bottom w:val="single" w:sz="6" w:color="C9D7EB" w:space="0"/>
-              <w:end w:val="single" w:sz="6" w:color="C9D7EB" w:space="0"/>
-            </w:tcBorders>
-            <w:shd w:fill="EAF2FF" w:val="clear"/>
+            <w:shd w:fill="F3F6FA"/>
           </w:tcPr>
           <w:p>
             <w:pPr>
-              <w:spacing w:after="0"/>
+              <w:keepNext w:val="0"/>
+              <w:spacing w:before="0" w:after="0" w:line="276" w:lineRule="auto"/>
               <w:jc w:val="center"/>
             </w:pPr>
             <w:r>
@@ -507,7 +555,7 @@
                 <w:rFonts w:ascii="Arial" w:hAnsi="Arial" w:eastAsia="Microsoft YaHei"/>
                 <w:b/>
                 <w:color w:val="1F4E78"/>
-                <w:sz w:val="22"/>
+                <w:sz w:val="21"/>
               </w:rPr>
               <w:t>平均分</w:t>
             </w:r>
@@ -518,22 +566,17 @@
             <w:tcW w:type="dxa" w:w="3137"/>
             <w:vAlign w:val="center"/>
             <w:tcMar>
-              <w:top w:w="120" w:type="dxa"/>
+              <w:top w:w="90" w:type="dxa"/>
               <w:start w:w="120" w:type="dxa"/>
-              <w:bottom w:w="120" w:type="dxa"/>
+              <w:bottom w:w="90" w:type="dxa"/>
               <w:end w:w="120" w:type="dxa"/>
             </w:tcMar>
-            <w:tcBorders>
-              <w:top w:val="single" w:sz="6" w:color="C9D7EB" w:space="0"/>
-              <w:start w:val="single" w:sz="6" w:color="C9D7EB" w:space="0"/>
-              <w:bottom w:val="single" w:sz="6" w:color="C9D7EB" w:space="0"/>
-              <w:end w:val="single" w:sz="6" w:color="C9D7EB" w:space="0"/>
-            </w:tcBorders>
-            <w:shd w:fill="EAF2FF" w:val="clear"/>
+            <w:shd w:fill="F3F6FA"/>
           </w:tcPr>
           <w:p>
             <w:pPr>
-              <w:spacing w:after="0"/>
+              <w:keepNext w:val="0"/>
+              <w:spacing w:before="0" w:after="0" w:line="276" w:lineRule="auto"/>
               <w:jc w:val="center"/>
             </w:pPr>
             <w:r>
@@ -541,7 +584,7 @@
                 <w:rFonts w:ascii="Arial" w:hAnsi="Arial" w:eastAsia="Microsoft YaHei"/>
                 <w:b/>
                 <w:color w:val="1F4E78"/>
-                <w:sz w:val="22"/>
+                <w:sz w:val="21"/>
               </w:rPr>
               <w:t>最高分</w:t>
             </w:r>
@@ -550,29 +593,25 @@
       </w:tr>
       <w:tr>
         <w:trPr>
-          <w:trHeight w:val="1134" w:hRule="atLeast"/>
+          <w:trHeight w:val="1020" w:hRule="atLeast"/>
+          <w:cantSplit/>
         </w:trPr>
         <w:tc>
           <w:tcPr>
             <w:tcW w:type="dxa" w:w="3137"/>
             <w:vAlign w:val="center"/>
             <w:tcMar>
-              <w:top w:w="120" w:type="dxa"/>
+              <w:top w:w="90" w:type="dxa"/>
               <w:start w:w="120" w:type="dxa"/>
-              <w:bottom w:w="120" w:type="dxa"/>
+              <w:bottom w:w="90" w:type="dxa"/>
               <w:end w:w="120" w:type="dxa"/>
             </w:tcMar>
-            <w:tcBorders>
-              <w:top w:val="single" w:sz="6" w:color="C9D7EB" w:space="0"/>
-              <w:start w:val="single" w:sz="6" w:color="C9D7EB" w:space="0"/>
-              <w:bottom w:val="single" w:sz="6" w:color="C9D7EB" w:space="0"/>
-              <w:end w:val="single" w:sz="6" w:color="C9D7EB" w:space="0"/>
-            </w:tcBorders>
-            <w:shd w:fill="FFFFFF" w:val="clear"/>
+            <w:shd w:fill="FFFFFF"/>
           </w:tcPr>
           <w:p>
             <w:pPr>
-              <w:spacing w:after="0"/>
+              <w:keepNext w:val="0"/>
+              <w:spacing w:before="0" w:after="0" w:line="276" w:lineRule="auto"/>
               <w:jc w:val="center"/>
             </w:pPr>
             <w:r>
@@ -580,7 +619,7 @@
                 <w:rFonts w:ascii="Arial" w:hAnsi="Arial" w:eastAsia="Microsoft YaHei"/>
                 <w:b/>
                 <w:color w:val="2563EB"/>
-                <w:sz w:val="42"/>
+                <w:sz w:val="38"/>
               </w:rPr>
               <w:t>{{ student_count }}</w:t>
             </w:r>
@@ -591,22 +630,17 @@
             <w:tcW w:type="dxa" w:w="3137"/>
             <w:vAlign w:val="center"/>
             <w:tcMar>
-              <w:top w:w="120" w:type="dxa"/>
+              <w:top w:w="90" w:type="dxa"/>
               <w:start w:w="120" w:type="dxa"/>
-              <w:bottom w:w="120" w:type="dxa"/>
+              <w:bottom w:w="90" w:type="dxa"/>
               <w:end w:w="120" w:type="dxa"/>
             </w:tcMar>
-            <w:tcBorders>
-              <w:top w:val="single" w:sz="6" w:color="C9D7EB" w:space="0"/>
-              <w:start w:val="single" w:sz="6" w:color="C9D7EB" w:space="0"/>
-              <w:bottom w:val="single" w:sz="6" w:color="C9D7EB" w:space="0"/>
-              <w:end w:val="single" w:sz="6" w:color="C9D7EB" w:space="0"/>
-            </w:tcBorders>
-            <w:shd w:fill="FFFFFF" w:val="clear"/>
+            <w:shd w:fill="FFFFFF"/>
           </w:tcPr>
           <w:p>
             <w:pPr>
-              <w:spacing w:after="0"/>
+              <w:keepNext w:val="0"/>
+              <w:spacing w:before="0" w:after="0" w:line="276" w:lineRule="auto"/>
               <w:jc w:val="center"/>
             </w:pPr>
             <w:r>
@@ -614,7 +648,7 @@
                 <w:rFonts w:ascii="Arial" w:hAnsi="Arial" w:eastAsia="Microsoft YaHei"/>
                 <w:b/>
                 <w:color w:val="2563EB"/>
-                <w:sz w:val="42"/>
+                <w:sz w:val="38"/>
               </w:rPr>
               <w:t>{{ average_score }}</w:t>
             </w:r>
@@ -625,22 +659,17 @@
             <w:tcW w:type="dxa" w:w="3137"/>
             <w:vAlign w:val="center"/>
             <w:tcMar>
-              <w:top w:w="120" w:type="dxa"/>
+              <w:top w:w="90" w:type="dxa"/>
               <w:start w:w="120" w:type="dxa"/>
-              <w:bottom w:w="120" w:type="dxa"/>
+              <w:bottom w:w="90" w:type="dxa"/>
               <w:end w:w="120" w:type="dxa"/>
             </w:tcMar>
-            <w:tcBorders>
-              <w:top w:val="single" w:sz="6" w:color="C9D7EB" w:space="0"/>
-              <w:start w:val="single" w:sz="6" w:color="C9D7EB" w:space="0"/>
-              <w:bottom w:val="single" w:sz="6" w:color="C9D7EB" w:space="0"/>
-              <w:end w:val="single" w:sz="6" w:color="C9D7EB" w:space="0"/>
-            </w:tcBorders>
-            <w:shd w:fill="FFFFFF" w:val="clear"/>
+            <w:shd w:fill="FFFFFF"/>
           </w:tcPr>
           <w:p>
             <w:pPr>
-              <w:spacing w:after="0"/>
+              <w:keepNext w:val="0"/>
+              <w:spacing w:before="0" w:after="0" w:line="276" w:lineRule="auto"/>
               <w:jc w:val="center"/>
             </w:pPr>
             <w:r>
@@ -648,7 +677,7 @@
                 <w:rFonts w:ascii="Arial" w:hAnsi="Arial" w:eastAsia="Microsoft YaHei"/>
                 <w:b/>
                 <w:color w:val="2563EB"/>
-                <w:sz w:val="42"/>
+                <w:sz w:val="38"/>
               </w:rPr>
               <w:t>{{ highest_score }}</w:t>
             </w:r>
@@ -657,29 +686,25 @@
       </w:tr>
       <w:tr>
         <w:trPr>
-          <w:trHeight w:val="680" w:hRule="atLeast"/>
+          <w:trHeight w:val="624" w:hRule="atLeast"/>
+          <w:cantSplit/>
         </w:trPr>
         <w:tc>
           <w:tcPr>
             <w:tcW w:type="dxa" w:w="3137"/>
             <w:vAlign w:val="center"/>
             <w:tcMar>
-              <w:top w:w="120" w:type="dxa"/>
+              <w:top w:w="90" w:type="dxa"/>
               <w:start w:w="120" w:type="dxa"/>
-              <w:bottom w:w="120" w:type="dxa"/>
+              <w:bottom w:w="90" w:type="dxa"/>
               <w:end w:w="120" w:type="dxa"/>
             </w:tcMar>
-            <w:tcBorders>
-              <w:top w:val="single" w:sz="6" w:color="C9D7EB" w:space="0"/>
-              <w:start w:val="single" w:sz="6" w:color="C9D7EB" w:space="0"/>
-              <w:bottom w:val="single" w:sz="6" w:color="C9D7EB" w:space="0"/>
-              <w:end w:val="single" w:sz="6" w:color="C9D7EB" w:space="0"/>
-            </w:tcBorders>
-            <w:shd w:fill="EAF2FF" w:val="clear"/>
+            <w:shd w:fill="F3F6FA"/>
           </w:tcPr>
           <w:p>
             <w:pPr>
-              <w:spacing w:after="0"/>
+              <w:keepNext w:val="0"/>
+              <w:spacing w:before="0" w:after="0" w:line="276" w:lineRule="auto"/>
               <w:jc w:val="center"/>
             </w:pPr>
             <w:r>
@@ -687,7 +712,7 @@
                 <w:rFonts w:ascii="Arial" w:hAnsi="Arial" w:eastAsia="Microsoft YaHei"/>
                 <w:b/>
                 <w:color w:val="1F4E78"/>
-                <w:sz w:val="22"/>
+                <w:sz w:val="21"/>
               </w:rPr>
               <w:t>最低分</w:t>
             </w:r>
@@ -698,22 +723,17 @@
             <w:tcW w:type="dxa" w:w="3137"/>
             <w:vAlign w:val="center"/>
             <w:tcMar>
-              <w:top w:w="120" w:type="dxa"/>
+              <w:top w:w="90" w:type="dxa"/>
               <w:start w:w="120" w:type="dxa"/>
-              <w:bottom w:w="120" w:type="dxa"/>
+              <w:bottom w:w="90" w:type="dxa"/>
               <w:end w:w="120" w:type="dxa"/>
             </w:tcMar>
-            <w:tcBorders>
-              <w:top w:val="single" w:sz="6" w:color="C9D7EB" w:space="0"/>
-              <w:start w:val="single" w:sz="6" w:color="C9D7EB" w:space="0"/>
-              <w:bottom w:val="single" w:sz="6" w:color="C9D7EB" w:space="0"/>
-              <w:end w:val="single" w:sz="6" w:color="C9D7EB" w:space="0"/>
-            </w:tcBorders>
-            <w:shd w:fill="EAF2FF" w:val="clear"/>
+            <w:shd w:fill="F3F6FA"/>
           </w:tcPr>
           <w:p>
             <w:pPr>
-              <w:spacing w:after="0"/>
+              <w:keepNext w:val="0"/>
+              <w:spacing w:before="0" w:after="0" w:line="276" w:lineRule="auto"/>
               <w:jc w:val="center"/>
             </w:pPr>
             <w:r>
@@ -721,7 +741,7 @@
                 <w:rFonts w:ascii="Arial" w:hAnsi="Arial" w:eastAsia="Microsoft YaHei"/>
                 <w:b/>
                 <w:color w:val="1F4E78"/>
-                <w:sz w:val="22"/>
+                <w:sz w:val="21"/>
               </w:rPr>
               <w:t>及格率</w:t>
             </w:r>
@@ -732,22 +752,17 @@
             <w:tcW w:type="dxa" w:w="3137"/>
             <w:vAlign w:val="center"/>
             <w:tcMar>
-              <w:top w:w="120" w:type="dxa"/>
+              <w:top w:w="90" w:type="dxa"/>
               <w:start w:w="120" w:type="dxa"/>
-              <w:bottom w:w="120" w:type="dxa"/>
+              <w:bottom w:w="90" w:type="dxa"/>
               <w:end w:w="120" w:type="dxa"/>
             </w:tcMar>
-            <w:tcBorders>
-              <w:top w:val="single" w:sz="6" w:color="C9D7EB" w:space="0"/>
-              <w:start w:val="single" w:sz="6" w:color="C9D7EB" w:space="0"/>
-              <w:bottom w:val="single" w:sz="6" w:color="C9D7EB" w:space="0"/>
-              <w:end w:val="single" w:sz="6" w:color="C9D7EB" w:space="0"/>
-            </w:tcBorders>
-            <w:shd w:fill="EAF2FF" w:val="clear"/>
+            <w:shd w:fill="F3F6FA"/>
           </w:tcPr>
           <w:p>
             <w:pPr>
-              <w:spacing w:after="0"/>
+              <w:keepNext w:val="0"/>
+              <w:spacing w:before="0" w:after="0" w:line="276" w:lineRule="auto"/>
               <w:jc w:val="center"/>
             </w:pPr>
             <w:r>
@@ -755,7 +770,7 @@
                 <w:rFonts w:ascii="Arial" w:hAnsi="Arial" w:eastAsia="Microsoft YaHei"/>
                 <w:b/>
                 <w:color w:val="1F4E78"/>
-                <w:sz w:val="22"/>
+                <w:sz w:val="21"/>
               </w:rPr>
               <w:t>优秀率</w:t>
             </w:r>
@@ -764,29 +779,25 @@
       </w:tr>
       <w:tr>
         <w:trPr>
-          <w:trHeight w:val="1134" w:hRule="atLeast"/>
+          <w:trHeight w:val="1020" w:hRule="atLeast"/>
+          <w:cantSplit/>
         </w:trPr>
         <w:tc>
           <w:tcPr>
             <w:tcW w:type="dxa" w:w="3137"/>
             <w:vAlign w:val="center"/>
             <w:tcMar>
-              <w:top w:w="120" w:type="dxa"/>
+              <w:top w:w="90" w:type="dxa"/>
               <w:start w:w="120" w:type="dxa"/>
-              <w:bottom w:w="120" w:type="dxa"/>
+              <w:bottom w:w="90" w:type="dxa"/>
               <w:end w:w="120" w:type="dxa"/>
             </w:tcMar>
-            <w:tcBorders>
-              <w:top w:val="single" w:sz="6" w:color="C9D7EB" w:space="0"/>
-              <w:start w:val="single" w:sz="6" w:color="C9D7EB" w:space="0"/>
-              <w:bottom w:val="single" w:sz="6" w:color="C9D7EB" w:space="0"/>
-              <w:end w:val="single" w:sz="6" w:color="C9D7EB" w:space="0"/>
-            </w:tcBorders>
-            <w:shd w:fill="FFFFFF" w:val="clear"/>
+            <w:shd w:fill="FFFFFF"/>
           </w:tcPr>
           <w:p>
             <w:pPr>
-              <w:spacing w:after="0"/>
+              <w:keepNext w:val="0"/>
+              <w:spacing w:before="0" w:after="0" w:line="276" w:lineRule="auto"/>
               <w:jc w:val="center"/>
             </w:pPr>
             <w:r>
@@ -794,7 +805,7 @@
                 <w:rFonts w:ascii="Arial" w:hAnsi="Arial" w:eastAsia="Microsoft YaHei"/>
                 <w:b/>
                 <w:color w:val="2563EB"/>
-                <w:sz w:val="42"/>
+                <w:sz w:val="38"/>
               </w:rPr>
               <w:t>{{ lowest_score }}</w:t>
             </w:r>
@@ -805,22 +816,17 @@
             <w:tcW w:type="dxa" w:w="3137"/>
             <w:vAlign w:val="center"/>
             <w:tcMar>
-              <w:top w:w="120" w:type="dxa"/>
+              <w:top w:w="90" w:type="dxa"/>
               <w:start w:w="120" w:type="dxa"/>
-              <w:bottom w:w="120" w:type="dxa"/>
+              <w:bottom w:w="90" w:type="dxa"/>
               <w:end w:w="120" w:type="dxa"/>
             </w:tcMar>
-            <w:tcBorders>
-              <w:top w:val="single" w:sz="6" w:color="C9D7EB" w:space="0"/>
-              <w:start w:val="single" w:sz="6" w:color="C9D7EB" w:space="0"/>
-              <w:bottom w:val="single" w:sz="6" w:color="C9D7EB" w:space="0"/>
-              <w:end w:val="single" w:sz="6" w:color="C9D7EB" w:space="0"/>
-            </w:tcBorders>
-            <w:shd w:fill="FFFFFF" w:val="clear"/>
+            <w:shd w:fill="FFFFFF"/>
           </w:tcPr>
           <w:p>
             <w:pPr>
-              <w:spacing w:after="0"/>
+              <w:keepNext w:val="0"/>
+              <w:spacing w:before="0" w:after="0" w:line="276" w:lineRule="auto"/>
               <w:jc w:val="center"/>
             </w:pPr>
             <w:r>
@@ -828,7 +834,7 @@
                 <w:rFonts w:ascii="Arial" w:hAnsi="Arial" w:eastAsia="Microsoft YaHei"/>
                 <w:b/>
                 <w:color w:val="2563EB"/>
-                <w:sz w:val="42"/>
+                <w:sz w:val="38"/>
               </w:rPr>
               <w:t>{{ pass_rate }}</w:t>
             </w:r>
@@ -839,22 +845,17 @@
             <w:tcW w:type="dxa" w:w="3137"/>
             <w:vAlign w:val="center"/>
             <w:tcMar>
-              <w:top w:w="120" w:type="dxa"/>
+              <w:top w:w="90" w:type="dxa"/>
               <w:start w:w="120" w:type="dxa"/>
-              <w:bottom w:w="120" w:type="dxa"/>
+              <w:bottom w:w="90" w:type="dxa"/>
               <w:end w:w="120" w:type="dxa"/>
             </w:tcMar>
-            <w:tcBorders>
-              <w:top w:val="single" w:sz="6" w:color="C9D7EB" w:space="0"/>
-              <w:start w:val="single" w:sz="6" w:color="C9D7EB" w:space="0"/>
-              <w:bottom w:val="single" w:sz="6" w:color="C9D7EB" w:space="0"/>
-              <w:end w:val="single" w:sz="6" w:color="C9D7EB" w:space="0"/>
-            </w:tcBorders>
-            <w:shd w:fill="FFFFFF" w:val="clear"/>
+            <w:shd w:fill="FFFFFF"/>
           </w:tcPr>
           <w:p>
             <w:pPr>
-              <w:spacing w:after="0"/>
+              <w:keepNext w:val="0"/>
+              <w:spacing w:before="0" w:after="0" w:line="276" w:lineRule="auto"/>
               <w:jc w:val="center"/>
             </w:pPr>
             <w:r>
@@ -862,7 +863,7 @@
                 <w:rFonts w:ascii="Arial" w:hAnsi="Arial" w:eastAsia="Microsoft YaHei"/>
                 <w:b/>
                 <w:color w:val="2563EB"/>
-                <w:sz w:val="42"/>
+                <w:sz w:val="38"/>
               </w:rPr>
               <w:t>{{ excellent_rate }}</w:t>
             </w:r>
@@ -873,30 +874,20 @@
     <w:p>
       <w:pPr>
         <w:pStyle w:val="Heading2"/>
-        <w:keepNext/>
+      </w:pPr>
+      <w:r>
+        <w:t>总体结论</w:t>
+      </w:r>
+    </w:p>
+    <w:p>
+      <w:pPr>
+        <w:keepNext w:val="0"/>
+        <w:spacing w:before="0" w:after="0" w:line="348" w:lineRule="auto"/>
       </w:pPr>
       <w:r>
         <w:rPr>
           <w:rFonts w:ascii="Arial" w:hAnsi="Arial" w:eastAsia="Microsoft YaHei"/>
-          <w:b/>
-          <w:color w:val="1F4E78"/>
-          <w:sz w:val="26"/>
-        </w:rPr>
-        <w:t>总体分析</w:t>
-      </w:r>
-    </w:p>
-    <w:p>
-      <w:pPr>
-        <w:spacing w:after="120" w:line="372" w:lineRule="auto"/>
-        <w:ind w:left="283" w:right="170"/>
-        <w:pBdr>
-          <w:left w:val="single" w:sz="18" w:color="2563EB" w:space="8"/>
-        </w:pBdr>
-        <w:shd w:val="clear" w:fill="F7FAFF"/>
-      </w:pPr>
-      <w:r>
-        <w:rPr>
-          <w:rFonts w:ascii="Arial" w:hAnsi="Arial" w:eastAsia="Microsoft YaHei"/>
+          <w:b w:val="0"/>
           <w:color w:val="374151"/>
           <w:sz w:val="21"/>
         </w:rPr>
@@ -904,9 +895,6 @@
       </w:r>
     </w:p>
     <w:p>
-      <w:pPr>
-        <w:spacing w:after="0"/>
-      </w:pPr>
       <w:r>
         <w:br w:type="page"/>
       </w:r>
@@ -914,66 +902,32 @@
     <w:p>
       <w:pPr>
         <w:pStyle w:val="Heading1"/>
-        <w:keepNext/>
       </w:pPr>
       <w:r>
-        <w:rPr>
-          <w:rFonts w:ascii="Arial" w:hAnsi="Arial" w:eastAsia="Microsoft YaHei"/>
-          <w:b/>
-          <w:color w:val="1F4E78"/>
-          <w:sz w:val="36"/>
-        </w:rPr>
         <w:t>二、成绩分布</w:t>
       </w:r>
     </w:p>
     <w:p>
       <w:pPr>
         <w:keepNext/>
+        <w:spacing w:before="0" w:after="60" w:line="276" w:lineRule="auto"/>
       </w:pPr>
       <w:r>
         <w:rPr>
           <w:rFonts w:ascii="Arial" w:hAnsi="Arial" w:eastAsia="Microsoft YaHei"/>
           <w:b w:val="0"/>
-          <w:color w:val="6B7280"/>
-          <w:sz w:val="21"/>
+          <w:color w:val="64748B"/>
+          <w:sz w:val="20"/>
         </w:rPr>
-        <w:t>下图展示当前分析成绩在各分数区间中的人数分布。</w:t>
+        <w:t>下图展示当前成绩列在各分数区间中的人数及占比。</w:t>
       </w:r>
     </w:p>
     <w:p>
       <w:pPr>
         <w:keepNext/>
-        <w:keepLines/>
-        <w:spacing w:before="160" w:after="160"/>
+        <w:spacing w:before="0" w:after="60" w:line="276" w:lineRule="auto"/>
         <w:jc w:val="center"/>
       </w:pPr>
-      <w:r>
-        <w:rPr>
-          <w:rFonts w:ascii="Arial" w:hAnsi="Arial" w:eastAsia="Microsoft YaHei"/>
-        </w:rPr>
-        <w:t>{{ distribution_chart }}</w:t>
-      </w:r>
-    </w:p>
-    <w:p>
-      <w:pPr>
-        <w:keepLines w:val="0"/>
-        <w:spacing w:before="200" w:after="160" w:line="348" w:lineRule="auto"/>
-        <w:ind w:left="283" w:right="170"/>
-        <w:pBdr>
-          <w:left w:val="single" w:sz="18" w:color="2563EB" w:space="8"/>
-        </w:pBdr>
-        <w:shd w:val="clear" w:fill="F7FAFF"/>
-      </w:pPr>
-      <w:r>
-        <w:rPr>
-          <w:rFonts w:ascii="Arial" w:hAnsi="Arial" w:eastAsia="Microsoft YaHei"/>
-          <w:b/>
-          <w:color w:val="1F4E78"/>
-          <w:sz w:val="23"/>
-        </w:rPr>
-        <w:t>分布结论</w:t>
-        <w:br/>
-      </w:r>
       <w:r>
         <w:rPr>
           <w:rFonts w:ascii="Arial" w:hAnsi="Arial" w:eastAsia="Microsoft YaHei"/>
@@ -981,13 +935,33 @@
           <w:color w:val="374151"/>
           <w:sz w:val="21"/>
         </w:rPr>
+        <w:t>{{ distribution_chart }}</w:t>
+      </w:r>
+    </w:p>
+    <w:p>
+      <w:pPr>
+        <w:pStyle w:val="Heading2"/>
+      </w:pPr>
+      <w:r>
+        <w:t>分布结论</w:t>
+      </w:r>
+    </w:p>
+    <w:p>
+      <w:pPr>
+        <w:keepNext w:val="0"/>
+        <w:spacing w:before="0" w:after="0" w:line="324" w:lineRule="auto"/>
+      </w:pPr>
+      <w:r>
+        <w:rPr>
+          <w:rFonts w:ascii="Arial" w:hAnsi="Arial" w:eastAsia="Microsoft YaHei"/>
+          <w:b w:val="0"/>
+          <w:color w:val="374151"/>
+          <w:sz w:val="20"/>
+        </w:rPr>
         <w:t>{{ distribution_analysis }}</w:t>
       </w:r>
     </w:p>
     <w:p>
-      <w:pPr>
-        <w:spacing w:after="0"/>
-      </w:pPr>
       <w:r>
         <w:br w:type="page"/>
       </w:r>
@@ -995,66 +969,25 @@
     <w:p>
       <w:pPr>
         <w:pStyle w:val="Heading1"/>
-        <w:keepNext/>
       </w:pPr>
       <w:r>
-        <w:rPr>
-          <w:rFonts w:ascii="Arial" w:hAnsi="Arial" w:eastAsia="Microsoft YaHei"/>
-          <w:b/>
-          <w:color w:val="1F4E78"/>
-          <w:sz w:val="36"/>
-        </w:rPr>
-        <w:t>三、等级结构</w:t>
+        <w:t>三、等级结构与各科平均分</w:t>
+      </w:r>
+    </w:p>
+    <w:p>
+      <w:pPr>
+        <w:pStyle w:val="Heading2"/>
+      </w:pPr>
+      <w:r>
+        <w:t>等级结构</w:t>
       </w:r>
     </w:p>
     <w:p>
       <w:pPr>
         <w:keepNext/>
-      </w:pPr>
-      <w:r>
-        <w:rPr>
-          <w:rFonts w:ascii="Arial" w:hAnsi="Arial" w:eastAsia="Microsoft YaHei"/>
-          <w:b w:val="0"/>
-          <w:color w:val="6B7280"/>
-          <w:sz w:val="21"/>
-        </w:rPr>
-        <w:t>下图展示当前分析成绩的等级人数及占比结构。</w:t>
-      </w:r>
-    </w:p>
-    <w:p>
-      <w:pPr>
-        <w:keepNext/>
-        <w:keepLines/>
-        <w:spacing w:before="160" w:after="160"/>
+        <w:spacing w:before="0" w:after="20" w:line="276" w:lineRule="auto"/>
         <w:jc w:val="center"/>
       </w:pPr>
-      <w:r>
-        <w:rPr>
-          <w:rFonts w:ascii="Arial" w:hAnsi="Arial" w:eastAsia="Microsoft YaHei"/>
-        </w:rPr>
-        <w:t>{{ level_chart }}</w:t>
-      </w:r>
-    </w:p>
-    <w:p>
-      <w:pPr>
-        <w:keepLines w:val="0"/>
-        <w:spacing w:before="200" w:after="160" w:line="348" w:lineRule="auto"/>
-        <w:ind w:left="283" w:right="170"/>
-        <w:pBdr>
-          <w:left w:val="single" w:sz="18" w:color="2563EB" w:space="8"/>
-        </w:pBdr>
-        <w:shd w:val="clear" w:fill="F7FAFF"/>
-      </w:pPr>
-      <w:r>
-        <w:rPr>
-          <w:rFonts w:ascii="Arial" w:hAnsi="Arial" w:eastAsia="Microsoft YaHei"/>
-          <w:b/>
-          <w:color w:val="1F4E78"/>
-          <w:sz w:val="23"/>
-        </w:rPr>
-        <w:t>等级结构结论</w:t>
-        <w:br/>
-      </w:r>
       <w:r>
         <w:rPr>
           <w:rFonts w:ascii="Arial" w:hAnsi="Arial" w:eastAsia="Microsoft YaHei"/>
@@ -1062,13 +995,110 @@
           <w:color w:val="374151"/>
           <w:sz w:val="21"/>
         </w:rPr>
+        <w:t>{{ level_chart }}</w:t>
+      </w:r>
+    </w:p>
+    <w:p>
+      <w:pPr>
+        <w:keepNext w:val="0"/>
+        <w:spacing w:before="0" w:after="40" w:line="293" w:lineRule="auto"/>
+      </w:pPr>
+      <w:r>
+        <w:rPr>
+          <w:rFonts w:ascii="Arial" w:hAnsi="Arial" w:eastAsia="Microsoft YaHei"/>
+          <w:b w:val="0"/>
+          <w:color w:val="374151"/>
+          <w:sz w:val="19"/>
+        </w:rPr>
         <w:t>{{ level_analysis }}</w:t>
       </w:r>
     </w:p>
     <w:p>
       <w:pPr>
-        <w:spacing w:after="0"/>
+        <w:pStyle w:val="Heading2"/>
       </w:pPr>
+      <w:r>
+        <w:t>各科平均分</w:t>
+      </w:r>
+    </w:p>
+    <w:p>
+      <w:pPr>
+        <w:keepNext w:val="0"/>
+        <w:spacing w:before="0" w:after="0" w:line="276" w:lineRule="auto"/>
+      </w:pPr>
+      <w:r>
+        <w:rPr>
+          <w:rFonts w:ascii="Arial" w:hAnsi="Arial" w:eastAsia="Microsoft YaHei"/>
+          <w:b w:val="0"/>
+          <w:color w:val="FFFFFF"/>
+          <w:sz w:val="2"/>
+        </w:rPr>
+        <w:t>{%p if subject_average_chart %}</w:t>
+      </w:r>
+    </w:p>
+    <w:p>
+      <w:pPr>
+        <w:keepNext/>
+        <w:spacing w:before="0" w:after="0" w:line="276" w:lineRule="auto"/>
+        <w:jc w:val="center"/>
+      </w:pPr>
+      <w:r>
+        <w:rPr>
+          <w:rFonts w:ascii="Arial" w:hAnsi="Arial" w:eastAsia="Microsoft YaHei"/>
+          <w:b w:val="0"/>
+          <w:color w:val="374151"/>
+          <w:sz w:val="21"/>
+        </w:rPr>
+        <w:t>{{ subject_average_chart }}</w:t>
+      </w:r>
+    </w:p>
+    <w:p>
+      <w:pPr>
+        <w:keepNext w:val="0"/>
+        <w:spacing w:before="0" w:after="0" w:line="276" w:lineRule="auto"/>
+      </w:pPr>
+      <w:r>
+        <w:rPr>
+          <w:rFonts w:ascii="Arial" w:hAnsi="Arial" w:eastAsia="Microsoft YaHei"/>
+          <w:b w:val="0"/>
+          <w:color w:val="FFFFFF"/>
+          <w:sz w:val="2"/>
+        </w:rPr>
+        <w:t>{%p else %}</w:t>
+      </w:r>
+    </w:p>
+    <w:p>
+      <w:pPr>
+        <w:keepNext w:val="0"/>
+        <w:spacing w:before="0" w:after="0" w:line="276" w:lineRule="auto"/>
+        <w:jc w:val="center"/>
+      </w:pPr>
+      <w:r>
+        <w:rPr>
+          <w:rFonts w:ascii="Arial" w:hAnsi="Arial" w:eastAsia="Microsoft YaHei"/>
+          <w:b w:val="0"/>
+          <w:color w:val="64748B"/>
+          <w:sz w:val="20"/>
+        </w:rPr>
+        <w:t>{{ subject_average_fallback }}</w:t>
+      </w:r>
+    </w:p>
+    <w:p>
+      <w:pPr>
+        <w:keepNext w:val="0"/>
+        <w:spacing w:before="0" w:after="0" w:line="276" w:lineRule="auto"/>
+      </w:pPr>
+      <w:r>
+        <w:rPr>
+          <w:rFonts w:ascii="Arial" w:hAnsi="Arial" w:eastAsia="Microsoft YaHei"/>
+          <w:b w:val="0"/>
+          <w:color w:val="FFFFFF"/>
+          <w:sz w:val="2"/>
+        </w:rPr>
+        <w:t>{%p endif %}</w:t>
+      </w:r>
+    </w:p>
+    <w:p>
       <w:r>
         <w:br w:type="page"/>
       </w:r>
@@ -1076,118 +1106,632 @@
     <w:p>
       <w:pPr>
         <w:pStyle w:val="Heading1"/>
-        <w:keepNext/>
       </w:pPr>
+      <w:r>
+        <w:t>四、重点学生摘要与教学建议</w:t>
+      </w:r>
+    </w:p>
+    <w:p>
+      <w:pPr>
+        <w:keepNext w:val="0"/>
+        <w:spacing w:before="0" w:after="20" w:line="276" w:lineRule="auto"/>
+      </w:pPr>
+      <w:r>
+        <w:rPr>
+          <w:rFonts w:ascii="Arial" w:hAnsi="Arial" w:eastAsia="Microsoft YaHei"/>
+          <w:b w:val="0"/>
+          <w:color w:val="374151"/>
+          <w:sz w:val="19"/>
+        </w:rPr>
+        <w:t>优秀学生共</w:t>
+      </w:r>
       <w:r>
         <w:rPr>
           <w:rFonts w:ascii="Arial" w:hAnsi="Arial" w:eastAsia="Microsoft YaHei"/>
           <w:b/>
           <w:color w:val="1F4E78"/>
-          <w:sz w:val="36"/>
+          <w:sz w:val="19"/>
         </w:rPr>
-        <w:t>四、重点学生名单与教学建议</w:t>
+        <w:t>{{ excellent_total_count }}</w:t>
+      </w:r>
+      <w:r>
+        <w:rPr>
+          <w:rFonts w:ascii="Arial" w:hAnsi="Arial" w:eastAsia="Microsoft YaHei"/>
+          <w:b w:val="0"/>
+          <w:color w:val="374151"/>
+          <w:sz w:val="19"/>
+        </w:rPr>
+        <w:t>人。</w:t>
+      </w:r>
+    </w:p>
+    <w:p>
+      <w:pPr>
+        <w:keepNext w:val="0"/>
+        <w:spacing w:before="0" w:after="0" w:line="276" w:lineRule="auto"/>
+      </w:pPr>
+      <w:r>
+        <w:rPr>
+          <w:rFonts w:ascii="Arial" w:hAnsi="Arial" w:eastAsia="Microsoft YaHei"/>
+          <w:b w:val="0"/>
+          <w:color w:val="FFFFFF"/>
+          <w:sz w:val="2"/>
+        </w:rPr>
+        <w:t>{%p if excellent_omitted_count %}</w:t>
+      </w:r>
+    </w:p>
+    <w:p>
+      <w:pPr>
+        <w:keepNext w:val="0"/>
+        <w:spacing w:before="0" w:after="40" w:line="276" w:lineRule="auto"/>
+      </w:pPr>
+      <w:r>
+        <w:rPr>
+          <w:rFonts w:ascii="Arial" w:hAnsi="Arial" w:eastAsia="Microsoft YaHei"/>
+          <w:b w:val="0"/>
+          <w:color w:val="64748B"/>
+          <w:sz w:val="18"/>
+        </w:rPr>
+        <w:t>本报告展示前10人，另有</w:t>
+      </w:r>
+      <w:r>
+        <w:rPr>
+          <w:rFonts w:ascii="Arial" w:hAnsi="Arial" w:eastAsia="Microsoft YaHei"/>
+          <w:b/>
+          <w:color w:val="1F4E78"/>
+          <w:sz w:val="18"/>
+        </w:rPr>
+        <w:t>{{ excellent_omitted_count }}</w:t>
+      </w:r>
+      <w:r>
+        <w:rPr>
+          <w:rFonts w:ascii="Arial" w:hAnsi="Arial" w:eastAsia="Microsoft YaHei"/>
+          <w:b w:val="0"/>
+          <w:color w:val="64748B"/>
+          <w:sz w:val="18"/>
+        </w:rPr>
+        <w:t>人未列出，完整名单请查看 Excel 导出。</w:t>
+      </w:r>
+    </w:p>
+    <w:p>
+      <w:pPr>
+        <w:keepNext w:val="0"/>
+        <w:spacing w:before="0" w:after="0" w:line="276" w:lineRule="auto"/>
+      </w:pPr>
+      <w:r>
+        <w:rPr>
+          <w:rFonts w:ascii="Arial" w:hAnsi="Arial" w:eastAsia="Microsoft YaHei"/>
+          <w:b w:val="0"/>
+          <w:color w:val="FFFFFF"/>
+          <w:sz w:val="2"/>
+        </w:rPr>
+        <w:t>{%p endif %}</w:t>
+      </w:r>
+    </w:p>
+    <w:p>
+      <w:pPr>
+        <w:keepNext w:val="0"/>
+        <w:spacing w:before="0" w:after="20" w:line="276" w:lineRule="auto"/>
+      </w:pPr>
+      <w:r>
+        <w:rPr>
+          <w:rFonts w:ascii="Arial" w:hAnsi="Arial" w:eastAsia="Microsoft YaHei"/>
+          <w:b w:val="0"/>
+          <w:color w:val="374151"/>
+          <w:sz w:val="19"/>
+        </w:rPr>
+        <w:t>待提升学生共</w:t>
+      </w:r>
+      <w:r>
+        <w:rPr>
+          <w:rFonts w:ascii="Arial" w:hAnsi="Arial" w:eastAsia="Microsoft YaHei"/>
+          <w:b/>
+          <w:color w:val="1F4E78"/>
+          <w:sz w:val="19"/>
+        </w:rPr>
+        <w:t>{{ struggling_total_count }}</w:t>
+      </w:r>
+      <w:r>
+        <w:rPr>
+          <w:rFonts w:ascii="Arial" w:hAnsi="Arial" w:eastAsia="Microsoft YaHei"/>
+          <w:b w:val="0"/>
+          <w:color w:val="374151"/>
+          <w:sz w:val="19"/>
+        </w:rPr>
+        <w:t>人。</w:t>
+      </w:r>
+    </w:p>
+    <w:p>
+      <w:pPr>
+        <w:keepNext w:val="0"/>
+        <w:spacing w:before="0" w:after="0" w:line="276" w:lineRule="auto"/>
+      </w:pPr>
+      <w:r>
+        <w:rPr>
+          <w:rFonts w:ascii="Arial" w:hAnsi="Arial" w:eastAsia="Microsoft YaHei"/>
+          <w:b w:val="0"/>
+          <w:color w:val="FFFFFF"/>
+          <w:sz w:val="2"/>
+        </w:rPr>
+        <w:t>{%p if struggling_omitted_count %}</w:t>
+      </w:r>
+    </w:p>
+    <w:p>
+      <w:pPr>
+        <w:keepNext w:val="0"/>
+        <w:spacing w:before="0" w:after="80" w:line="276" w:lineRule="auto"/>
+      </w:pPr>
+      <w:r>
+        <w:rPr>
+          <w:rFonts w:ascii="Arial" w:hAnsi="Arial" w:eastAsia="Microsoft YaHei"/>
+          <w:b w:val="0"/>
+          <w:color w:val="64748B"/>
+          <w:sz w:val="18"/>
+        </w:rPr>
+        <w:t>本报告展示前10人，另有</w:t>
+      </w:r>
+      <w:r>
+        <w:rPr>
+          <w:rFonts w:ascii="Arial" w:hAnsi="Arial" w:eastAsia="Microsoft YaHei"/>
+          <w:b/>
+          <w:color w:val="1F4E78"/>
+          <w:sz w:val="18"/>
+        </w:rPr>
+        <w:t>{{ struggling_omitted_count }}</w:t>
+      </w:r>
+      <w:r>
+        <w:rPr>
+          <w:rFonts w:ascii="Arial" w:hAnsi="Arial" w:eastAsia="Microsoft YaHei"/>
+          <w:b w:val="0"/>
+          <w:color w:val="64748B"/>
+          <w:sz w:val="18"/>
+        </w:rPr>
+        <w:t>人未列出，完整名单请查看 Excel 导出。</w:t>
+      </w:r>
+    </w:p>
+    <w:p>
+      <w:pPr>
+        <w:keepNext w:val="0"/>
+        <w:spacing w:before="0" w:after="0" w:line="276" w:lineRule="auto"/>
+      </w:pPr>
+      <w:r>
+        <w:rPr>
+          <w:rFonts w:ascii="Arial" w:hAnsi="Arial" w:eastAsia="Microsoft YaHei"/>
+          <w:b w:val="0"/>
+          <w:color w:val="FFFFFF"/>
+          <w:sz w:val="2"/>
+        </w:rPr>
+        <w:t>{%p endif %}</w:t>
+      </w:r>
+    </w:p>
+    <w:tbl>
+      <w:tblPr>
+        <w:tblStyle w:val="TableGrid"/>
+        <w:tblW w:type="dxa" w:w="9411"/>
+        <w:jc w:val="center"/>
+        <w:tblLayout w:type="fixed"/>
+        <w:tblLook w:firstColumn="1" w:firstRow="1" w:lastColumn="0" w:lastRow="0" w:noHBand="0" w:noVBand="1" w:val="04A0"/>
+      </w:tblPr>
+      <w:tblGrid>
+        <w:gridCol w:w="3458"/>
+        <w:gridCol w:w="1247"/>
+        <w:gridCol w:w="3458"/>
+        <w:gridCol w:w="1247"/>
+      </w:tblGrid>
+      <w:tr>
+        <w:trPr>
+          <w:trHeight w:val="454" w:hRule="atLeast"/>
+          <w:tblHeader w:val="true"/>
+          <w:cantSplit/>
+        </w:trPr>
+        <w:tc>
+          <w:tcPr>
+            <w:tcW w:type="dxa" w:w="3458"/>
+            <w:vAlign w:val="center"/>
+            <w:tcMar>
+              <w:top w:w="90" w:type="dxa"/>
+              <w:start w:w="120" w:type="dxa"/>
+              <w:bottom w:w="90" w:type="dxa"/>
+              <w:end w:w="120" w:type="dxa"/>
+            </w:tcMar>
+            <w:shd w:fill="1F4E78"/>
+          </w:tcPr>
+          <w:p>
+            <w:pPr>
+              <w:keepNext w:val="0"/>
+              <w:spacing w:before="0" w:after="0" w:line="276" w:lineRule="auto"/>
+              <w:jc w:val="center"/>
+            </w:pPr>
+            <w:r>
+              <w:rPr>
+                <w:rFonts w:ascii="Arial" w:hAnsi="Arial" w:eastAsia="Microsoft YaHei"/>
+                <w:b/>
+                <w:color w:val="FFFFFF"/>
+                <w:sz w:val="19"/>
+              </w:rPr>
+              <w:t>优秀学生</w:t>
+            </w:r>
+          </w:p>
+        </w:tc>
+        <w:tc>
+          <w:tcPr>
+            <w:tcW w:type="dxa" w:w="1247"/>
+            <w:vAlign w:val="center"/>
+            <w:tcMar>
+              <w:top w:w="90" w:type="dxa"/>
+              <w:start w:w="120" w:type="dxa"/>
+              <w:bottom w:w="90" w:type="dxa"/>
+              <w:end w:w="120" w:type="dxa"/>
+            </w:tcMar>
+            <w:shd w:fill="1F4E78"/>
+          </w:tcPr>
+          <w:p>
+            <w:pPr>
+              <w:keepNext w:val="0"/>
+              <w:spacing w:before="0" w:after="0" w:line="276" w:lineRule="auto"/>
+              <w:jc w:val="center"/>
+            </w:pPr>
+            <w:r>
+              <w:rPr>
+                <w:rFonts w:ascii="Arial" w:hAnsi="Arial" w:eastAsia="Microsoft YaHei"/>
+                <w:b/>
+                <w:color w:val="FFFFFF"/>
+                <w:sz w:val="19"/>
+              </w:rPr>
+              <w:t>分数</w:t>
+            </w:r>
+          </w:p>
+        </w:tc>
+        <w:tc>
+          <w:tcPr>
+            <w:tcW w:type="dxa" w:w="3458"/>
+            <w:vAlign w:val="center"/>
+            <w:tcMar>
+              <w:top w:w="90" w:type="dxa"/>
+              <w:start w:w="120" w:type="dxa"/>
+              <w:bottom w:w="90" w:type="dxa"/>
+              <w:end w:w="120" w:type="dxa"/>
+            </w:tcMar>
+            <w:shd w:fill="1F4E78"/>
+          </w:tcPr>
+          <w:p>
+            <w:pPr>
+              <w:keepNext w:val="0"/>
+              <w:spacing w:before="0" w:after="0" w:line="276" w:lineRule="auto"/>
+              <w:jc w:val="center"/>
+            </w:pPr>
+            <w:r>
+              <w:rPr>
+                <w:rFonts w:ascii="Arial" w:hAnsi="Arial" w:eastAsia="Microsoft YaHei"/>
+                <w:b/>
+                <w:color w:val="FFFFFF"/>
+                <w:sz w:val="19"/>
+              </w:rPr>
+              <w:t>待提升学生</w:t>
+            </w:r>
+          </w:p>
+        </w:tc>
+        <w:tc>
+          <w:tcPr>
+            <w:tcW w:type="dxa" w:w="1247"/>
+            <w:vAlign w:val="center"/>
+            <w:tcMar>
+              <w:top w:w="90" w:type="dxa"/>
+              <w:start w:w="120" w:type="dxa"/>
+              <w:bottom w:w="90" w:type="dxa"/>
+              <w:end w:w="120" w:type="dxa"/>
+            </w:tcMar>
+            <w:shd w:fill="1F4E78"/>
+          </w:tcPr>
+          <w:p>
+            <w:pPr>
+              <w:keepNext w:val="0"/>
+              <w:spacing w:before="0" w:after="0" w:line="276" w:lineRule="auto"/>
+              <w:jc w:val="center"/>
+            </w:pPr>
+            <w:r>
+              <w:rPr>
+                <w:rFonts w:ascii="Arial" w:hAnsi="Arial" w:eastAsia="Microsoft YaHei"/>
+                <w:b/>
+                <w:color w:val="FFFFFF"/>
+                <w:sz w:val="19"/>
+              </w:rPr>
+              <w:t>分数</w:t>
+            </w:r>
+          </w:p>
+        </w:tc>
+      </w:tr>
+      <w:tr>
+        <w:trPr>
+          <w:trHeight w:val="397" w:hRule="atLeast"/>
+          <w:cantSplit/>
+        </w:trPr>
+        <w:tc>
+          <w:tcPr>
+            <w:tcW w:type="dxa" w:w="3458"/>
+            <w:vAlign w:val="center"/>
+            <w:tcMar>
+              <w:top w:w="90" w:type="dxa"/>
+              <w:start w:w="120" w:type="dxa"/>
+              <w:bottom w:w="90" w:type="dxa"/>
+              <w:end w:w="120" w:type="dxa"/>
+            </w:tcMar>
+          </w:tcPr>
+          <w:p>
+            <w:r>
+              <w:rPr>
+                <w:rFonts w:ascii="Arial" w:hAnsi="Arial" w:eastAsia="Microsoft YaHei"/>
+                <w:b w:val="0"/>
+                <w:color w:val="FFFFFF"/>
+                <w:sz w:val="2"/>
+              </w:rPr>
+              <w:t>{%tr for student in excellent_display_students %}</w:t>
+            </w:r>
+          </w:p>
+        </w:tc>
+        <w:tc>
+          <w:tcPr>
+            <w:tcW w:type="dxa" w:w="1247"/>
+            <w:vAlign w:val="center"/>
+            <w:tcMar>
+              <w:top w:w="90" w:type="dxa"/>
+              <w:start w:w="120" w:type="dxa"/>
+              <w:bottom w:w="90" w:type="dxa"/>
+              <w:end w:w="120" w:type="dxa"/>
+            </w:tcMar>
+          </w:tcPr>
+          <w:p/>
+        </w:tc>
+        <w:tc>
+          <w:tcPr>
+            <w:tcW w:type="dxa" w:w="3458"/>
+            <w:vAlign w:val="center"/>
+            <w:tcMar>
+              <w:top w:w="90" w:type="dxa"/>
+              <w:start w:w="120" w:type="dxa"/>
+              <w:bottom w:w="90" w:type="dxa"/>
+              <w:end w:w="120" w:type="dxa"/>
+            </w:tcMar>
+          </w:tcPr>
+          <w:p/>
+        </w:tc>
+        <w:tc>
+          <w:tcPr>
+            <w:tcW w:type="dxa" w:w="1247"/>
+            <w:vAlign w:val="center"/>
+            <w:tcMar>
+              <w:top w:w="90" w:type="dxa"/>
+              <w:start w:w="120" w:type="dxa"/>
+              <w:bottom w:w="90" w:type="dxa"/>
+              <w:end w:w="120" w:type="dxa"/>
+            </w:tcMar>
+          </w:tcPr>
+          <w:p/>
+        </w:tc>
+      </w:tr>
+      <w:tr>
+        <w:trPr>
+          <w:trHeight w:val="397" w:hRule="atLeast"/>
+          <w:cantSplit/>
+        </w:trPr>
+        <w:tc>
+          <w:tcPr>
+            <w:tcW w:type="dxa" w:w="3458"/>
+            <w:vAlign w:val="center"/>
+            <w:tcMar>
+              <w:top w:w="90" w:type="dxa"/>
+              <w:start w:w="120" w:type="dxa"/>
+              <w:bottom w:w="90" w:type="dxa"/>
+              <w:end w:w="120" w:type="dxa"/>
+            </w:tcMar>
+          </w:tcPr>
+          <w:p>
+            <w:r>
+              <w:rPr>
+                <w:rFonts w:ascii="Arial" w:hAnsi="Arial" w:eastAsia="Microsoft YaHei"/>
+                <w:b w:val="0"/>
+                <w:color w:val="374151"/>
+                <w:sz w:val="19"/>
+              </w:rPr>
+              <w:t>{{ student.name }}</w:t>
+            </w:r>
+          </w:p>
+        </w:tc>
+        <w:tc>
+          <w:tcPr>
+            <w:tcW w:type="dxa" w:w="1247"/>
+            <w:vAlign w:val="center"/>
+            <w:tcMar>
+              <w:top w:w="90" w:type="dxa"/>
+              <w:start w:w="120" w:type="dxa"/>
+              <w:bottom w:w="90" w:type="dxa"/>
+              <w:end w:w="120" w:type="dxa"/>
+            </w:tcMar>
+          </w:tcPr>
+          <w:p>
+            <w:pPr>
+              <w:jc w:val="center"/>
+            </w:pPr>
+            <w:r>
+              <w:rPr>
+                <w:rFonts w:ascii="Arial" w:hAnsi="Arial" w:eastAsia="Microsoft YaHei"/>
+                <w:b w:val="0"/>
+                <w:color w:val="374151"/>
+                <w:sz w:val="19"/>
+              </w:rPr>
+              <w:t>{{ student.score }}</w:t>
+            </w:r>
+          </w:p>
+        </w:tc>
+        <w:tc>
+          <w:tcPr>
+            <w:tcW w:type="dxa" w:w="3458"/>
+            <w:vAlign w:val="center"/>
+            <w:tcMar>
+              <w:top w:w="90" w:type="dxa"/>
+              <w:start w:w="120" w:type="dxa"/>
+              <w:bottom w:w="90" w:type="dxa"/>
+              <w:end w:w="120" w:type="dxa"/>
+            </w:tcMar>
+          </w:tcPr>
+          <w:p>
+            <w:r>
+              <w:rPr>
+                <w:rFonts w:ascii="Arial" w:hAnsi="Arial" w:eastAsia="Microsoft YaHei"/>
+                <w:b w:val="0"/>
+                <w:color w:val="374151"/>
+                <w:sz w:val="19"/>
+              </w:rPr>
+              <w:t>{{ struggling_display_students[loop.index0].name }}</w:t>
+            </w:r>
+          </w:p>
+        </w:tc>
+        <w:tc>
+          <w:tcPr>
+            <w:tcW w:type="dxa" w:w="1247"/>
+            <w:vAlign w:val="center"/>
+            <w:tcMar>
+              <w:top w:w="90" w:type="dxa"/>
+              <w:start w:w="120" w:type="dxa"/>
+              <w:bottom w:w="90" w:type="dxa"/>
+              <w:end w:w="120" w:type="dxa"/>
+            </w:tcMar>
+          </w:tcPr>
+          <w:p>
+            <w:pPr>
+              <w:jc w:val="center"/>
+            </w:pPr>
+            <w:r>
+              <w:rPr>
+                <w:rFonts w:ascii="Arial" w:hAnsi="Arial" w:eastAsia="Microsoft YaHei"/>
+                <w:b w:val="0"/>
+                <w:color w:val="374151"/>
+                <w:sz w:val="19"/>
+              </w:rPr>
+              <w:t>{{ struggling_display_students[loop.index0].score }}</w:t>
+            </w:r>
+          </w:p>
+        </w:tc>
+      </w:tr>
+      <w:tr>
+        <w:trPr>
+          <w:trHeight w:val="397" w:hRule="atLeast"/>
+          <w:cantSplit/>
+        </w:trPr>
+        <w:tc>
+          <w:tcPr>
+            <w:tcW w:type="dxa" w:w="3458"/>
+            <w:vAlign w:val="center"/>
+            <w:tcMar>
+              <w:top w:w="90" w:type="dxa"/>
+              <w:start w:w="120" w:type="dxa"/>
+              <w:bottom w:w="90" w:type="dxa"/>
+              <w:end w:w="120" w:type="dxa"/>
+            </w:tcMar>
+          </w:tcPr>
+          <w:p>
+            <w:r>
+              <w:rPr>
+                <w:rFonts w:ascii="Arial" w:hAnsi="Arial" w:eastAsia="Microsoft YaHei"/>
+                <w:b w:val="0"/>
+                <w:color w:val="FFFFFF"/>
+                <w:sz w:val="2"/>
+              </w:rPr>
+              <w:t>{%tr endfor %}</w:t>
+            </w:r>
+          </w:p>
+        </w:tc>
+        <w:tc>
+          <w:tcPr>
+            <w:tcW w:type="dxa" w:w="1247"/>
+            <w:vAlign w:val="center"/>
+            <w:tcMar>
+              <w:top w:w="90" w:type="dxa"/>
+              <w:start w:w="120" w:type="dxa"/>
+              <w:bottom w:w="90" w:type="dxa"/>
+              <w:end w:w="120" w:type="dxa"/>
+            </w:tcMar>
+          </w:tcPr>
+          <w:p/>
+        </w:tc>
+        <w:tc>
+          <w:tcPr>
+            <w:tcW w:type="dxa" w:w="3458"/>
+            <w:vAlign w:val="center"/>
+            <w:tcMar>
+              <w:top w:w="90" w:type="dxa"/>
+              <w:start w:w="120" w:type="dxa"/>
+              <w:bottom w:w="90" w:type="dxa"/>
+              <w:end w:w="120" w:type="dxa"/>
+            </w:tcMar>
+          </w:tcPr>
+          <w:p/>
+        </w:tc>
+        <w:tc>
+          <w:tcPr>
+            <w:tcW w:type="dxa" w:w="1247"/>
+            <w:vAlign w:val="center"/>
+            <w:tcMar>
+              <w:top w:w="90" w:type="dxa"/>
+              <w:start w:w="120" w:type="dxa"/>
+              <w:bottom w:w="90" w:type="dxa"/>
+              <w:end w:w="120" w:type="dxa"/>
+            </w:tcMar>
+          </w:tcPr>
+          <w:p/>
+        </w:tc>
+      </w:tr>
+    </w:tbl>
+    <w:p>
+      <w:pPr>
+        <w:pStyle w:val="Heading2"/>
+      </w:pPr>
+      <w:r>
+        <w:t>教学建议</w:t>
+      </w:r>
+    </w:p>
+    <w:p>
+      <w:pPr>
+        <w:keepNext w:val="0"/>
+        <w:spacing w:before="0" w:after="40" w:line="300" w:lineRule="auto"/>
+      </w:pPr>
+      <w:r>
+        <w:rPr>
+          <w:rFonts w:ascii="Arial" w:hAnsi="Arial" w:eastAsia="Microsoft YaHei"/>
+          <w:b w:val="0"/>
+          <w:color w:val="374151"/>
+          <w:sz w:val="19"/>
+        </w:rPr>
+        <w:t>{{ teaching_suggestions }}</w:t>
       </w:r>
     </w:p>
     <w:p>
       <w:pPr>
         <w:pStyle w:val="Heading2"/>
-        <w:keepNext/>
+      </w:pPr>
+      <w:r>
+        <w:t>数据说明</w:t>
+      </w:r>
+    </w:p>
+    <w:p>
+      <w:pPr>
+        <w:keepNext w:val="0"/>
+        <w:spacing w:before="0" w:after="0" w:line="288" w:lineRule="auto"/>
       </w:pPr>
       <w:r>
         <w:rPr>
           <w:rFonts w:ascii="Arial" w:hAnsi="Arial" w:eastAsia="Microsoft YaHei"/>
-          <w:b/>
-          <w:color w:val="1F4E78"/>
-          <w:sz w:val="26"/>
+          <w:b w:val="0"/>
+          <w:color w:val="64748B"/>
+          <w:sz w:val="17"/>
         </w:rPr>
-        <w:t>优秀学生名单</w:t>
-      </w:r>
-    </w:p>
-    <w:p>
-      <w:pPr>
-        <w:spacing w:after="200" w:line="312" w:lineRule="auto"/>
-        <w:ind w:left="283"/>
-        <w:pBdr>
-          <w:left w:val="single" w:sz="12" w:color="2563EB" w:space="6"/>
-        </w:pBdr>
-      </w:pPr>
-      <w:r>
-        <w:rPr>
-          <w:rFonts w:ascii="Arial" w:hAnsi="Arial" w:eastAsia="Microsoft YaHei"/>
-          <w:color w:val="374151"/>
-          <w:sz w:val="21"/>
-        </w:rPr>
-        <w:t>{{ excellent_students }}</w:t>
-      </w:r>
-    </w:p>
-    <w:p>
-      <w:pPr>
-        <w:pStyle w:val="Heading2"/>
-        <w:keepNext/>
-      </w:pPr>
-      <w:r>
-        <w:rPr>
-          <w:rFonts w:ascii="Arial" w:hAnsi="Arial" w:eastAsia="Microsoft YaHei"/>
-          <w:b/>
-          <w:color w:val="1F4E78"/>
-          <w:sz w:val="26"/>
-        </w:rPr>
-        <w:t>待提升学生名单</w:t>
-      </w:r>
-    </w:p>
-    <w:p>
-      <w:pPr>
-        <w:spacing w:after="200" w:line="312" w:lineRule="auto"/>
-        <w:ind w:left="283"/>
-        <w:pBdr>
-          <w:left w:val="single" w:sz="12" w:color="F59E0B" w:space="6"/>
-        </w:pBdr>
-      </w:pPr>
-      <w:r>
-        <w:rPr>
-          <w:rFonts w:ascii="Arial" w:hAnsi="Arial" w:eastAsia="Microsoft YaHei"/>
-          <w:color w:val="374151"/>
-          <w:sz w:val="21"/>
-        </w:rPr>
-        <w:t>{{ struggling_students }}</w:t>
-      </w:r>
-    </w:p>
-    <w:p>
-      <w:pPr>
-        <w:pStyle w:val="Heading2"/>
-        <w:keepNext/>
-      </w:pPr>
-      <w:r>
-        <w:rPr>
-          <w:rFonts w:ascii="Arial" w:hAnsi="Arial" w:eastAsia="Microsoft YaHei"/>
-          <w:b/>
-          <w:color w:val="1F4E78"/>
-          <w:sz w:val="26"/>
-        </w:rPr>
-        <w:t>教学建议</w:t>
-      </w:r>
-    </w:p>
-    <w:p>
-      <w:pPr>
-        <w:spacing w:line="360" w:lineRule="auto"/>
-        <w:ind w:left="283" w:right="170"/>
-        <w:pBdr>
-          <w:left w:val="single" w:sz="18" w:color="2563EB" w:space="8"/>
-        </w:pBdr>
-        <w:shd w:val="clear" w:fill="F7FAFF"/>
-      </w:pPr>
-      <w:r>
-        <w:rPr>
-          <w:rFonts w:ascii="Arial" w:hAnsi="Arial" w:eastAsia="Microsoft YaHei"/>
-          <w:color w:val="374151"/>
-          <w:sz w:val="21"/>
-        </w:rPr>
-        <w:t>{{ teaching_suggestions }}</w:t>
+        <w:t>{{ data_note }}</w:t>
       </w:r>
     </w:p>
     <w:sectPr>
       <w:headerReference w:type="default" r:id="rId9"/>
-      <w:footerReference w:type="default" r:id="rId10"/>
+      <w:headerReference w:type="first" r:id="rId10"/>
+      <w:footerReference w:type="default" r:id="rId11"/>
+      <w:footerReference w:type="first" r:id="rId12"/>
       <w:pgSz w:w="11906" w:h="16838"/>
       <w:pgMar w:top="1020" w:right="1247" w:bottom="1020" w:left="1247" w:header="454" w:footer="510" w:gutter="0"/>
       <w:cols w:space="720"/>
@@ -1203,40 +1747,46 @@
   <w:p>
     <w:pPr>
       <w:pStyle w:val="Footer"/>
-      <w:spacing w:before="60"/>
       <w:jc w:val="center"/>
-      <w:pBdr>
-        <w:top w:val="single" w:sz="6" w:color="C9D7EB" w:space="4"/>
-      </w:pBdr>
     </w:pPr>
     <w:r>
       <w:rPr>
         <w:rFonts w:ascii="Arial" w:hAnsi="Arial" w:eastAsia="Microsoft YaHei"/>
-        <w:color w:val="1F4E78"/>
-        <w:sz w:val="17"/>
+        <w:b w:val="0"/>
+        <w:color w:val="64748B"/>
+        <w:sz w:val="18"/>
       </w:rPr>
       <w:t xml:space="preserve">— </w:t>
     </w:r>
     <w:r>
-      <w:rPr>
-        <w:rFonts w:ascii="Arial" w:hAnsi="Arial" w:eastAsia="Microsoft YaHei"/>
-        <w:color w:val="1F4E78"/>
-        <w:sz w:val="17"/>
-      </w:rPr>
       <w:fldChar w:fldCharType="begin"/>
+    </w:r>
+    <w:r>
       <w:instrText xml:space="preserve"> PAGE </w:instrText>
-      <w:fldChar w:fldCharType="separate"/>
-      <w:t>2</w:t>
+    </w:r>
+    <w:r>
       <w:fldChar w:fldCharType="end"/>
     </w:r>
     <w:r>
       <w:rPr>
         <w:rFonts w:ascii="Arial" w:hAnsi="Arial" w:eastAsia="Microsoft YaHei"/>
-        <w:color w:val="1F4E78"/>
-        <w:sz w:val="17"/>
+        <w:b w:val="0"/>
+        <w:color w:val="64748B"/>
+        <w:sz w:val="18"/>
       </w:rPr>
       <w:t xml:space="preserve"> —</w:t>
     </w:r>
+  </w:p>
+</w:ftr>
+</file>
+
+<file path=word/footer2.xml><?xml version="1.0" encoding="utf-8"?>
+<w:ftr xmlns:m="http://schemas.openxmlformats.org/officeDocument/2006/math" xmlns:mc="http://schemas.openxmlformats.org/markup-compatibility/2006" xmlns:mo="http://schemas.microsoft.com/office/mac/office/2008/main" xmlns:mv="urn:schemas-microsoft-com:mac:vml" xmlns:o="urn:schemas-microsoft-com:office:office" xmlns:r="http://schemas.openxmlformats.org/officeDocument/2006/relationships" xmlns:v="urn:schemas-microsoft-com:vml" xmlns:w10="urn:schemas-microsoft-com:office:word" xmlns:w14="http://schemas.microsoft.com/office/word/2010/wordml" xmlns:w="http://schemas.openxmlformats.org/wordprocessingml/2006/main" xmlns:wne="http://schemas.microsoft.com/office/word/2006/wordml" xmlns:wp14="http://schemas.microsoft.com/office/word/2010/wordprocessingDrawing" xmlns:wp="http://schemas.openxmlformats.org/drawingml/2006/wordprocessingDrawing" xmlns:wpc="http://schemas.microsoft.com/office/word/2010/wordprocessingCanvas" xmlns:wpg="http://schemas.microsoft.com/office/word/2010/wordprocessingGroup" xmlns:wpi="http://schemas.microsoft.com/office/word/2010/wordprocessingInk" xmlns:wps="http://schemas.microsoft.com/office/word/2010/wordprocessingShape" mc:Ignorable="w14 wp14">
+  <w:p>
+    <w:pPr>
+      <w:pStyle w:val="Footer"/>
+    </w:pPr>
+    <w:r/>
   </w:p>
 </w:ftr>
 </file>
@@ -1246,13 +1796,9 @@
   <w:p>
     <w:pPr>
       <w:pStyle w:val="Header"/>
-      <w:tabs>
-        <w:tab w:pos="9411" w:val="right"/>
-      </w:tabs>
-      <w:spacing w:after="60"/>
-      <w:pBdr>
-        <w:bottom w:val="single" w:sz="8" w:color="2563EB" w:space="3"/>
-      </w:pBdr>
+      <w:keepNext w:val="0"/>
+      <w:spacing w:before="0" w:after="0" w:line="276" w:lineRule="auto"/>
+      <w:jc w:val="left"/>
     </w:pPr>
     <w:r>
       <w:rPr>
@@ -1267,12 +1813,23 @@
       <w:rPr>
         <w:rFonts w:ascii="Arial" w:hAnsi="Arial" w:eastAsia="Microsoft YaHei"/>
         <w:b w:val="0"/>
-        <w:color w:val="6B7280"/>
-        <w:sz w:val="17"/>
+        <w:color w:val="64748B"/>
+        <w:sz w:val="18"/>
       </w:rPr>
       <w:tab/>
       <w:t>数据统计 · 可视化分析 · 教学参考</w:t>
     </w:r>
+  </w:p>
+</w:hdr>
+</file>
+
+<file path=word/header2.xml><?xml version="1.0" encoding="utf-8"?>
+<w:hdr xmlns:m="http://schemas.openxmlformats.org/officeDocument/2006/math" xmlns:mc="http://schemas.openxmlformats.org/markup-compatibility/2006" xmlns:mo="http://schemas.microsoft.com/office/mac/office/2008/main" xmlns:mv="urn:schemas-microsoft-com:mac:vml" xmlns:o="urn:schemas-microsoft-com:office:office" xmlns:r="http://schemas.openxmlformats.org/officeDocument/2006/relationships" xmlns:v="urn:schemas-microsoft-com:vml" xmlns:w10="urn:schemas-microsoft-com:office:word" xmlns:w14="http://schemas.microsoft.com/office/word/2010/wordml" xmlns:w="http://schemas.openxmlformats.org/wordprocessingml/2006/main" xmlns:wne="http://schemas.microsoft.com/office/word/2006/wordml" xmlns:wp14="http://schemas.microsoft.com/office/word/2010/wordprocessingDrawing" xmlns:wp="http://schemas.openxmlformats.org/drawingml/2006/wordprocessingDrawing" xmlns:wpc="http://schemas.microsoft.com/office/word/2010/wordprocessingCanvas" xmlns:wpg="http://schemas.microsoft.com/office/word/2010/wordprocessingGroup" xmlns:wpi="http://schemas.microsoft.com/office/word/2010/wordprocessingInk" xmlns:wps="http://schemas.microsoft.com/office/word/2010/wordprocessingShape" mc:Ignorable="w14 wp14">
+  <w:p>
+    <w:pPr>
+      <w:pStyle w:val="Header"/>
+    </w:pPr>
+    <w:r/>
   </w:p>
 </w:hdr>
 </file>
@@ -1641,7 +2198,7 @@
     <w:qFormat/>
     <w:rsid w:val="00FC693F"/>
     <w:pPr>
-      <w:spacing w:after="100" w:line="324" w:lineRule="auto"/>
+      <w:spacing w:after="100" w:line="312" w:lineRule="auto"/>
     </w:pPr>
     <w:rPr>
       <w:rFonts w:ascii="Arial" w:hAnsi="Arial" w:eastAsia="Microsoft YaHei"/>
@@ -1704,7 +2261,7 @@
     <w:pPr>
       <w:keepNext/>
       <w:keepLines/>
-      <w:spacing w:before="0" w:after="240"/>
+      <w:spacing w:before="0" w:after="160"/>
       <w:outlineLvl w:val="0"/>
     </w:pPr>
     <w:rPr>
@@ -1712,7 +2269,7 @@
       <w:b/>
       <w:bCs/>
       <w:color w:val="1F4E78"/>
-      <w:sz w:val="36"/>
+      <w:sz w:val="35"/>
       <w:szCs w:val="28"/>
     </w:rPr>
   </w:style>
@@ -1728,7 +2285,7 @@
     <w:pPr>
       <w:keepNext/>
       <w:keepLines/>
-      <w:spacing w:before="240" w:after="120"/>
+      <w:spacing w:before="140" w:after="80"/>
       <w:outlineLvl w:val="1"/>
     </w:pPr>
     <w:rPr>
@@ -1736,7 +2293,7 @@
       <w:b/>
       <w:bCs/>
       <w:color w:val="1F4E78"/>
-      <w:sz w:val="26"/>
+      <w:sz w:val="25"/>
       <w:szCs w:val="26"/>
     </w:rPr>
   </w:style>
@@ -1991,10 +2548,11 @@
     <w:rsid w:val="00FC693F"/>
     <w:pPr>
       <w:keepNext/>
+      <w:keepLines/>
       <w:pBdr>
         <w:bottom w:val="single" w:sz="8" w:space="4" w:color="4F81BD" w:themeColor="accent1"/>
       </w:pBdr>
-      <w:spacing w:after="360" w:line="240" w:lineRule="auto" w:before="0"/>
+      <w:spacing w:after="320" w:line="240" w:lineRule="auto" w:before="0"/>
       <w:contextualSpacing/>
     </w:pPr>
     <w:rPr>
@@ -2003,7 +2561,7 @@
       <w:color w:val="1F4E78"/>
       <w:spacing w:val="5"/>
       <w:kern w:val="28"/>
-      <w:sz w:val="56"/>
+      <w:sz w:val="54"/>
       <w:szCs w:val="52"/>
     </w:rPr>
   </w:style>

</xml_diff>